<commit_message>
Add supplementary documents, update existing to fit standard
</commit_message>
<xml_diff>
--- a/MoM_Template.docx
+++ b/MoM_Template.docx
@@ -184,11 +184,11 @@
         <w:tblLook w:val="04A0" w:firstRow="1" w:lastRow="0" w:firstColumn="1" w:lastColumn="0" w:noHBand="0" w:noVBand="1"/>
       </w:tblPr>
       <w:tblGrid>
-        <w:gridCol w:w="1870"/>
-        <w:gridCol w:w="1870"/>
-        <w:gridCol w:w="1870"/>
-        <w:gridCol w:w="1870"/>
-        <w:gridCol w:w="1870"/>
+        <w:gridCol w:w="1796"/>
+        <w:gridCol w:w="1722"/>
+        <w:gridCol w:w="1978"/>
+        <w:gridCol w:w="2039"/>
+        <w:gridCol w:w="1815"/>
       </w:tblGrid>
       <w:tr>
         <w:tc>
@@ -293,6 +293,54 @@
                 <w:rFonts w:ascii="Arial" w:hAnsi="Arial" w:cs="Arial"/>
               </w:rPr>
             </w:pPr>
+            <w:r>
+              <w:rPr>
+                <w:rFonts w:ascii="Arial" w:hAnsi="Arial" w:cs="Arial"/>
+              </w:rPr>
+              <w:t xml:space="preserve">{% tr </w:t>
+            </w:r>
+            <w:proofErr w:type="gramStart"/>
+            <w:r>
+              <w:rPr>
+                <w:rFonts w:ascii="Arial" w:hAnsi="Arial" w:cs="Arial"/>
+              </w:rPr>
+              <w:t>%}{</w:t>
+            </w:r>
+            <w:proofErr w:type="gramEnd"/>
+            <w:r>
+              <w:rPr>
+                <w:rFonts w:ascii="Arial" w:hAnsi="Arial" w:cs="Arial"/>
+              </w:rPr>
+              <w:t xml:space="preserve">% for a in attendees %} </w:t>
+            </w:r>
+            <w:proofErr w:type="gramStart"/>
+            <w:r>
+              <w:rPr>
+                <w:rFonts w:ascii="Arial" w:hAnsi="Arial" w:cs="Arial"/>
+              </w:rPr>
+              <w:t xml:space="preserve">{{ </w:t>
+            </w:r>
+            <w:proofErr w:type="spellStart"/>
+            <w:r>
+              <w:rPr>
+                <w:rFonts w:ascii="Arial" w:hAnsi="Arial" w:cs="Arial"/>
+              </w:rPr>
+              <w:t>loop</w:t>
+            </w:r>
+            <w:proofErr w:type="gramEnd"/>
+            <w:r>
+              <w:rPr>
+                <w:rFonts w:ascii="Arial" w:hAnsi="Arial" w:cs="Arial"/>
+              </w:rPr>
+              <w:t>.index</w:t>
+            </w:r>
+            <w:proofErr w:type="spellEnd"/>
+            <w:r>
+              <w:rPr>
+                <w:rFonts w:ascii="Arial" w:hAnsi="Arial" w:cs="Arial"/>
+              </w:rPr>
+              <w:t xml:space="preserve"> }}</w:t>
+            </w:r>
           </w:p>
         </w:tc>
         <w:tc>
@@ -305,6 +353,34 @@
                 <w:rFonts w:ascii="Arial" w:hAnsi="Arial" w:cs="Arial"/>
               </w:rPr>
             </w:pPr>
+            <w:proofErr w:type="gramStart"/>
+            <w:r>
+              <w:rPr>
+                <w:rFonts w:ascii="Arial" w:hAnsi="Arial" w:cs="Arial"/>
+              </w:rPr>
+              <w:t xml:space="preserve">{{ </w:t>
+            </w:r>
+            <w:proofErr w:type="spellStart"/>
+            <w:r>
+              <w:rPr>
+                <w:rFonts w:ascii="Arial" w:hAnsi="Arial" w:cs="Arial"/>
+              </w:rPr>
+              <w:t>a</w:t>
+            </w:r>
+            <w:proofErr w:type="gramEnd"/>
+            <w:r>
+              <w:rPr>
+                <w:rFonts w:ascii="Arial" w:hAnsi="Arial" w:cs="Arial"/>
+              </w:rPr>
+              <w:t>.Name</w:t>
+            </w:r>
+            <w:proofErr w:type="spellEnd"/>
+            <w:r>
+              <w:rPr>
+                <w:rFonts w:ascii="Arial" w:hAnsi="Arial" w:cs="Arial"/>
+              </w:rPr>
+              <w:t xml:space="preserve"> }}</w:t>
+            </w:r>
           </w:p>
         </w:tc>
         <w:tc>
@@ -317,6 +393,20 @@
                 <w:rFonts w:ascii="Arial" w:hAnsi="Arial" w:cs="Arial"/>
               </w:rPr>
             </w:pPr>
+            <w:proofErr w:type="gramStart"/>
+            <w:r>
+              <w:rPr>
+                <w:rFonts w:ascii="Arial" w:hAnsi="Arial" w:cs="Arial"/>
+              </w:rPr>
+              <w:t>{{ a</w:t>
+            </w:r>
+            <w:proofErr w:type="gramEnd"/>
+            <w:r>
+              <w:rPr>
+                <w:rFonts w:ascii="Arial" w:hAnsi="Arial" w:cs="Arial"/>
+              </w:rPr>
+              <w:t>.Designation }}</w:t>
+            </w:r>
           </w:p>
         </w:tc>
         <w:tc>
@@ -329,6 +419,34 @@
                 <w:rFonts w:ascii="Arial" w:hAnsi="Arial" w:cs="Arial"/>
               </w:rPr>
             </w:pPr>
+            <w:proofErr w:type="gramStart"/>
+            <w:r>
+              <w:rPr>
+                <w:rFonts w:ascii="Arial" w:hAnsi="Arial" w:cs="Arial"/>
+              </w:rPr>
+              <w:t xml:space="preserve">{{ </w:t>
+            </w:r>
+            <w:proofErr w:type="spellStart"/>
+            <w:r>
+              <w:rPr>
+                <w:rFonts w:ascii="Arial" w:hAnsi="Arial" w:cs="Arial"/>
+              </w:rPr>
+              <w:t>a</w:t>
+            </w:r>
+            <w:proofErr w:type="gramEnd"/>
+            <w:r>
+              <w:rPr>
+                <w:rFonts w:ascii="Arial" w:hAnsi="Arial" w:cs="Arial"/>
+              </w:rPr>
+              <w:t>.Abbreviation</w:t>
+            </w:r>
+            <w:proofErr w:type="spellEnd"/>
+            <w:r>
+              <w:rPr>
+                <w:rFonts w:ascii="Arial" w:hAnsi="Arial" w:cs="Arial"/>
+              </w:rPr>
+              <w:t xml:space="preserve"> }}</w:t>
+            </w:r>
           </w:p>
         </w:tc>
         <w:tc>
@@ -341,6 +459,48 @@
                 <w:rFonts w:ascii="Arial" w:hAnsi="Arial" w:cs="Arial"/>
               </w:rPr>
             </w:pPr>
+            <w:proofErr w:type="gramStart"/>
+            <w:r>
+              <w:rPr>
+                <w:rFonts w:ascii="Arial" w:hAnsi="Arial" w:cs="Arial"/>
+              </w:rPr>
+              <w:t>{{ a</w:t>
+            </w:r>
+            <w:proofErr w:type="gramEnd"/>
+            <w:r>
+              <w:rPr>
+                <w:rFonts w:ascii="Arial" w:hAnsi="Arial" w:cs="Arial"/>
+              </w:rPr>
+              <w:t>.</w:t>
+            </w:r>
+            <w:proofErr w:type="gramStart"/>
+            <w:r>
+              <w:rPr>
+                <w:rFonts w:ascii="Arial" w:hAnsi="Arial" w:cs="Arial"/>
+              </w:rPr>
+              <w:t>Attended }</w:t>
+            </w:r>
+            <w:proofErr w:type="gramEnd"/>
+            <w:r>
+              <w:rPr>
+                <w:rFonts w:ascii="Arial" w:hAnsi="Arial" w:cs="Arial"/>
+              </w:rPr>
+              <w:t xml:space="preserve">} {% endfor </w:t>
+            </w:r>
+            <w:proofErr w:type="gramStart"/>
+            <w:r>
+              <w:rPr>
+                <w:rFonts w:ascii="Arial" w:hAnsi="Arial" w:cs="Arial"/>
+              </w:rPr>
+              <w:t>%}{</w:t>
+            </w:r>
+            <w:proofErr w:type="gramEnd"/>
+            <w:r>
+              <w:rPr>
+                <w:rFonts w:ascii="Arial" w:hAnsi="Arial" w:cs="Arial"/>
+              </w:rPr>
+              <w:t>% tr %}</w:t>
+            </w:r>
           </w:p>
         </w:tc>
       </w:tr>
@@ -559,11 +719,11 @@
         <w:tblLook w:val="04A0" w:firstRow="1" w:lastRow="0" w:firstColumn="1" w:lastColumn="0" w:noHBand="0" w:noVBand="1"/>
       </w:tblPr>
       <w:tblGrid>
-        <w:gridCol w:w="1870"/>
-        <w:gridCol w:w="1870"/>
-        <w:gridCol w:w="1870"/>
-        <w:gridCol w:w="1870"/>
-        <w:gridCol w:w="1870"/>
+        <w:gridCol w:w="1845"/>
+        <w:gridCol w:w="1941"/>
+        <w:gridCol w:w="1865"/>
+        <w:gridCol w:w="1853"/>
+        <w:gridCol w:w="1846"/>
       </w:tblGrid>
       <w:tr>
         <w:trPr>
@@ -684,19 +844,63 @@
               <w:rPr>
                 <w:rFonts w:ascii="Arial" w:hAnsi="Arial" w:cs="Arial"/>
               </w:rPr>
-              <w:t>{{</w:t>
-            </w:r>
-            <w:r>
-              <w:rPr>
-                <w:rFonts w:ascii="Arial" w:hAnsi="Arial" w:cs="Arial"/>
-              </w:rPr>
-              <w:t>LIST</w:t>
-            </w:r>
-            <w:r>
-              <w:rPr>
-                <w:rFonts w:ascii="Arial" w:hAnsi="Arial" w:cs="Arial"/>
-              </w:rPr>
-              <w:t>}}</w:t>
+              <w:t xml:space="preserve">{% tr </w:t>
+            </w:r>
+            <w:proofErr w:type="gramStart"/>
+            <w:r>
+              <w:rPr>
+                <w:rFonts w:ascii="Arial" w:hAnsi="Arial" w:cs="Arial"/>
+              </w:rPr>
+              <w:t>%}{</w:t>
+            </w:r>
+            <w:proofErr w:type="gramEnd"/>
+            <w:r>
+              <w:rPr>
+                <w:rFonts w:ascii="Arial" w:hAnsi="Arial" w:cs="Arial"/>
+              </w:rPr>
+              <w:t xml:space="preserve">% </w:t>
+            </w:r>
+            <w:proofErr w:type="spellStart"/>
+            <w:r>
+              <w:rPr>
+                <w:rFonts w:ascii="Arial" w:hAnsi="Arial" w:cs="Arial"/>
+              </w:rPr>
+              <w:t>for m</w:t>
+            </w:r>
+            <w:proofErr w:type="spellEnd"/>
+            <w:r>
+              <w:rPr>
+                <w:rFonts w:ascii="Arial" w:hAnsi="Arial" w:cs="Arial"/>
+              </w:rPr>
+              <w:t xml:space="preserve"> in matters %} </w:t>
+            </w:r>
+            <w:proofErr w:type="gramStart"/>
+            <w:r>
+              <w:rPr>
+                <w:rFonts w:ascii="Arial" w:hAnsi="Arial" w:cs="Arial"/>
+              </w:rPr>
+              <w:t xml:space="preserve">{{ </w:t>
+            </w:r>
+            <w:proofErr w:type="spellStart"/>
+            <w:r>
+              <w:rPr>
+                <w:rFonts w:ascii="Arial" w:hAnsi="Arial" w:cs="Arial"/>
+              </w:rPr>
+              <w:t>loop</w:t>
+            </w:r>
+            <w:proofErr w:type="gramEnd"/>
+            <w:r>
+              <w:rPr>
+                <w:rFonts w:ascii="Arial" w:hAnsi="Arial" w:cs="Arial"/>
+              </w:rPr>
+              <w:t>.index</w:t>
+            </w:r>
+            <w:proofErr w:type="spellEnd"/>
+            <w:r>
+              <w:rPr>
+                <w:rFonts w:ascii="Arial" w:hAnsi="Arial" w:cs="Arial"/>
+              </w:rPr>
+              <w:t xml:space="preserve"> }}</w:t>
             </w:r>
           </w:p>
         </w:tc>
@@ -712,26 +916,125 @@
                 <w:bCs/>
               </w:rPr>
             </w:pPr>
-            <w:r>
-              <w:rPr>
-                <w:rFonts w:ascii="Arial" w:hAnsi="Arial" w:cs="Arial"/>
-                <w:b/>
-                <w:bCs/>
-              </w:rPr>
-              <w:t>{{ITEM 1}}</w:t>
-            </w:r>
-          </w:p>
-          <w:p>
-            <w:pPr>
-              <w:rPr>
-                <w:rFonts w:ascii="Arial" w:hAnsi="Arial" w:cs="Arial"/>
-              </w:rPr>
-            </w:pPr>
-            <w:r>
-              <w:rPr>
-                <w:rFonts w:ascii="Arial" w:hAnsi="Arial" w:cs="Arial"/>
-              </w:rPr>
-              <w:t>{{NAME}} {{DESCRIPTION OF ITEM}}</w:t>
+            <w:proofErr w:type="gramStart"/>
+            <w:r>
+              <w:rPr>
+                <w:rFonts w:ascii="Arial" w:hAnsi="Arial" w:cs="Arial"/>
+                <w:b/>
+                <w:bCs/>
+              </w:rPr>
+              <w:t xml:space="preserve">{{ </w:t>
+            </w:r>
+            <w:proofErr w:type="spellStart"/>
+            <w:r>
+              <w:rPr>
+                <w:rFonts w:ascii="Arial" w:hAnsi="Arial" w:cs="Arial"/>
+                <w:b/>
+                <w:bCs/>
+              </w:rPr>
+              <w:t>m</w:t>
+            </w:r>
+            <w:proofErr w:type="gramEnd"/>
+            <w:r>
+              <w:rPr>
+                <w:rFonts w:ascii="Arial" w:hAnsi="Arial" w:cs="Arial"/>
+                <w:b/>
+                <w:bCs/>
+              </w:rPr>
+              <w:t>.</w:t>
+            </w:r>
+            <w:proofErr w:type="gramStart"/>
+            <w:r>
+              <w:rPr>
+                <w:rFonts w:ascii="Arial" w:hAnsi="Arial" w:cs="Arial"/>
+                <w:b/>
+                <w:bCs/>
+              </w:rPr>
+              <w:t>topic</w:t>
+            </w:r>
+            <w:proofErr w:type="spellEnd"/>
+            <w:r>
+              <w:rPr>
+                <w:rFonts w:ascii="Arial" w:hAnsi="Arial" w:cs="Arial"/>
+                <w:b/>
+                <w:bCs/>
+              </w:rPr>
+              <w:t xml:space="preserve"> }</w:t>
+            </w:r>
+            <w:proofErr w:type="gramEnd"/>
+            <w:r>
+              <w:rPr>
+                <w:rFonts w:ascii="Arial" w:hAnsi="Arial" w:cs="Arial"/>
+                <w:b/>
+                <w:bCs/>
+              </w:rPr>
+              <w:t>}</w:t>
+            </w:r>
+          </w:p>
+          <w:p>
+            <w:pPr>
+              <w:rPr>
+                <w:rFonts w:ascii="Arial" w:hAnsi="Arial" w:cs="Arial"/>
+                <w:b/>
+                <w:bCs/>
+              </w:rPr>
+            </w:pPr>
+            <w:r>
+              <w:rPr>
+                <w:rFonts w:ascii="Arial" w:hAnsi="Arial" w:cs="Arial"/>
+                <w:b/>
+                <w:bCs/>
+              </w:rPr>
+              <w:br/>
+            </w:r>
+          </w:p>
+          <w:p>
+            <w:pPr>
+              <w:rPr>
+                <w:rFonts w:ascii="Arial" w:hAnsi="Arial" w:cs="Arial"/>
+              </w:rPr>
+            </w:pPr>
+            <w:proofErr w:type="gramStart"/>
+            <w:r>
+              <w:rPr>
+                <w:rFonts w:ascii="Arial" w:hAnsi="Arial" w:cs="Arial"/>
+              </w:rPr>
+              <w:t xml:space="preserve">{{ </w:t>
+            </w:r>
+            <w:proofErr w:type="spellStart"/>
+            <w:r>
+              <w:rPr>
+                <w:rFonts w:ascii="Arial" w:hAnsi="Arial" w:cs="Arial"/>
+              </w:rPr>
+              <w:t>m</w:t>
+            </w:r>
+            <w:proofErr w:type="gramEnd"/>
+            <w:r>
+              <w:rPr>
+                <w:rFonts w:ascii="Arial" w:hAnsi="Arial" w:cs="Arial"/>
+              </w:rPr>
+              <w:t>.</w:t>
+            </w:r>
+            <w:proofErr w:type="gramStart"/>
+            <w:r>
+              <w:rPr>
+                <w:rFonts w:ascii="Arial" w:hAnsi="Arial" w:cs="Arial"/>
+              </w:rPr>
+              <w:t>description</w:t>
+            </w:r>
+            <w:proofErr w:type="spellEnd"/>
+            <w:r>
+              <w:rPr>
+                <w:rFonts w:ascii="Arial" w:hAnsi="Arial" w:cs="Arial"/>
+              </w:rPr>
+              <w:t xml:space="preserve"> }</w:t>
+            </w:r>
+            <w:proofErr w:type="gramEnd"/>
+            <w:r>
+              <w:rPr>
+                <w:rFonts w:ascii="Arial" w:hAnsi="Arial" w:cs="Arial"/>
+              </w:rPr>
+              <w:t>}</w:t>
             </w:r>
           </w:p>
           <w:p>
@@ -754,19 +1057,34 @@
                 <w:rFonts w:ascii="Arial" w:hAnsi="Arial" w:cs="Arial"/>
               </w:rPr>
             </w:pPr>
-            <w:r>
-              <w:rPr>
-                <w:rFonts w:ascii="Arial" w:hAnsi="Arial" w:cs="Arial"/>
-              </w:rPr>
-              <w:t>{{ACTION OWNER – ITEM 1}}</w:t>
-            </w:r>
-          </w:p>
-          <w:p>
-            <w:pPr>
-              <w:rPr>
-                <w:rFonts w:ascii="Arial" w:hAnsi="Arial" w:cs="Arial"/>
-              </w:rPr>
-            </w:pPr>
+            <w:proofErr w:type="gramStart"/>
+            <w:r>
+              <w:rPr>
+                <w:rFonts w:ascii="Arial" w:hAnsi="Arial" w:cs="Arial"/>
+              </w:rPr>
+              <w:t xml:space="preserve">{{ </w:t>
+            </w:r>
+            <w:proofErr w:type="spellStart"/>
+            <w:r>
+              <w:rPr>
+                <w:rFonts w:ascii="Arial" w:hAnsi="Arial" w:cs="Arial"/>
+              </w:rPr>
+              <w:t>m</w:t>
+            </w:r>
+            <w:proofErr w:type="gramEnd"/>
+            <w:r>
+              <w:rPr>
+                <w:rFonts w:ascii="Arial" w:hAnsi="Arial" w:cs="Arial"/>
+              </w:rPr>
+              <w:t>.action_by</w:t>
+            </w:r>
+            <w:proofErr w:type="spellEnd"/>
+            <w:r>
+              <w:rPr>
+                <w:rFonts w:ascii="Arial" w:hAnsi="Arial" w:cs="Arial"/>
+              </w:rPr>
+              <w:t xml:space="preserve"> }}</w:t>
+            </w:r>
           </w:p>
         </w:tc>
         <w:tc>
@@ -779,11 +1097,33 @@
                 <w:rFonts w:ascii="Arial" w:hAnsi="Arial" w:cs="Arial"/>
               </w:rPr>
             </w:pPr>
-            <w:r>
-              <w:rPr>
-                <w:rFonts w:ascii="Arial" w:hAnsi="Arial" w:cs="Arial"/>
-              </w:rPr>
-              <w:t>{{DAY}} {{MONTH}} {{YEAR}}</w:t>
+            <w:proofErr w:type="gramStart"/>
+            <w:r>
+              <w:rPr>
+                <w:rFonts w:ascii="Arial" w:hAnsi="Arial" w:cs="Arial"/>
+              </w:rPr>
+              <w:t xml:space="preserve">{{ </w:t>
+            </w:r>
+            <w:proofErr w:type="spellStart"/>
+            <w:r>
+              <w:rPr>
+                <w:rFonts w:ascii="Arial" w:hAnsi="Arial" w:cs="Arial"/>
+              </w:rPr>
+              <w:t>m</w:t>
+            </w:r>
+            <w:proofErr w:type="gramEnd"/>
+            <w:r>
+              <w:rPr>
+                <w:rFonts w:ascii="Arial" w:hAnsi="Arial" w:cs="Arial"/>
+              </w:rPr>
+              <w:t>.deadline</w:t>
+            </w:r>
+            <w:proofErr w:type="spellEnd"/>
+            <w:r>
+              <w:rPr>
+                <w:rFonts w:ascii="Arial" w:hAnsi="Arial" w:cs="Arial"/>
+              </w:rPr>
+              <w:t xml:space="preserve"> }}</w:t>
             </w:r>
           </w:p>
         </w:tc>
@@ -801,7 +1141,77 @@
               <w:rPr>
                 <w:rFonts w:ascii="Arial" w:hAnsi="Arial" w:cs="Arial"/>
               </w:rPr>
-              <w:t>Status: {{STATUS}}</w:t>
+              <w:t xml:space="preserve">Status: </w:t>
+            </w:r>
+            <w:proofErr w:type="gramStart"/>
+            <w:r>
+              <w:rPr>
+                <w:rFonts w:ascii="Arial" w:hAnsi="Arial" w:cs="Arial"/>
+              </w:rPr>
+              <w:t xml:space="preserve">{{ </w:t>
+            </w:r>
+            <w:proofErr w:type="spellStart"/>
+            <w:r>
+              <w:rPr>
+                <w:rFonts w:ascii="Arial" w:hAnsi="Arial" w:cs="Arial"/>
+              </w:rPr>
+              <w:t>m</w:t>
+            </w:r>
+            <w:proofErr w:type="gramEnd"/>
+            <w:r>
+              <w:rPr>
+                <w:rFonts w:ascii="Arial" w:hAnsi="Arial" w:cs="Arial"/>
+              </w:rPr>
+              <w:t>.</w:t>
+            </w:r>
+            <w:proofErr w:type="gramStart"/>
+            <w:r>
+              <w:rPr>
+                <w:rFonts w:ascii="Arial" w:hAnsi="Arial" w:cs="Arial"/>
+              </w:rPr>
+              <w:t>status</w:t>
+            </w:r>
+            <w:proofErr w:type="spellEnd"/>
+            <w:r>
+              <w:rPr>
+                <w:rFonts w:ascii="Arial" w:hAnsi="Arial" w:cs="Arial"/>
+              </w:rPr>
+              <w:t xml:space="preserve"> }</w:t>
+            </w:r>
+            <w:proofErr w:type="gramEnd"/>
+            <w:r>
+              <w:rPr>
+                <w:rFonts w:ascii="Arial" w:hAnsi="Arial" w:cs="Arial"/>
+              </w:rPr>
+              <w:t xml:space="preserve">} {% </w:t>
+            </w:r>
+            <w:proofErr w:type="spellStart"/>
+            <w:r>
+              <w:rPr>
+                <w:rFonts w:ascii="Arial" w:hAnsi="Arial" w:cs="Arial"/>
+              </w:rPr>
+              <w:t>endfor</w:t>
+            </w:r>
+            <w:proofErr w:type="spellEnd"/>
+            <w:r>
+              <w:rPr>
+                <w:rFonts w:ascii="Arial" w:hAnsi="Arial" w:cs="Arial"/>
+              </w:rPr>
+              <w:t xml:space="preserve"> </w:t>
+            </w:r>
+            <w:proofErr w:type="gramStart"/>
+            <w:r>
+              <w:rPr>
+                <w:rFonts w:ascii="Arial" w:hAnsi="Arial" w:cs="Arial"/>
+              </w:rPr>
+              <w:t>%}{</w:t>
+            </w:r>
+            <w:proofErr w:type="gramEnd"/>
+            <w:r>
+              <w:rPr>
+                <w:rFonts w:ascii="Arial" w:hAnsi="Arial" w:cs="Arial"/>
+              </w:rPr>
+              <w:t>% tr %}</w:t>
             </w:r>
           </w:p>
         </w:tc>
@@ -828,23 +1238,7 @@
           <w:bCs/>
         </w:rPr>
         <w:lastRenderedPageBreak/>
-        <w:t>3</w:t>
-      </w:r>
-      <w:r>
-        <w:rPr>
-          <w:rFonts w:ascii="Arial" w:hAnsi="Arial" w:cs="Arial"/>
-          <w:b/>
-          <w:bCs/>
-        </w:rPr>
-        <w:t xml:space="preserve">. </w:t>
-      </w:r>
-      <w:r>
-        <w:rPr>
-          <w:rFonts w:ascii="Arial" w:hAnsi="Arial" w:cs="Arial"/>
-          <w:b/>
-          <w:bCs/>
-        </w:rPr>
-        <w:t>Project Scorecard and Updates</w:t>
+        <w:t>3. Project Scorecard and Updates</w:t>
       </w:r>
     </w:p>
     <w:tbl>
@@ -854,9 +1248,9 @@
         <w:tblLook w:val="04A0" w:firstRow="1" w:lastRow="0" w:firstColumn="1" w:lastColumn="0" w:noHBand="0" w:noVBand="1"/>
       </w:tblPr>
       <w:tblGrid>
-        <w:gridCol w:w="1705"/>
-        <w:gridCol w:w="4515"/>
-        <w:gridCol w:w="3110"/>
+        <w:gridCol w:w="1745"/>
+        <w:gridCol w:w="4503"/>
+        <w:gridCol w:w="3102"/>
       </w:tblGrid>
       <w:tr>
         <w:trPr>
@@ -935,19 +1329,81 @@
               <w:rPr>
                 <w:rFonts w:ascii="Arial" w:hAnsi="Arial" w:cs="Arial"/>
               </w:rPr>
-              <w:t>{{</w:t>
-            </w:r>
-            <w:r>
-              <w:rPr>
-                <w:rFonts w:ascii="Arial" w:hAnsi="Arial" w:cs="Arial"/>
-              </w:rPr>
-              <w:t>LIST</w:t>
-            </w:r>
-            <w:r>
-              <w:rPr>
-                <w:rFonts w:ascii="Arial" w:hAnsi="Arial" w:cs="Arial"/>
-              </w:rPr>
-              <w:t>}}</w:t>
+              <w:t xml:space="preserve">{% tr </w:t>
+            </w:r>
+            <w:proofErr w:type="gramStart"/>
+            <w:r>
+              <w:rPr>
+                <w:rFonts w:ascii="Arial" w:hAnsi="Arial" w:cs="Arial"/>
+              </w:rPr>
+              <w:t>%}{</w:t>
+            </w:r>
+            <w:proofErr w:type="gramEnd"/>
+            <w:r>
+              <w:rPr>
+                <w:rFonts w:ascii="Arial" w:hAnsi="Arial" w:cs="Arial"/>
+              </w:rPr>
+              <w:t xml:space="preserve">% for </w:t>
+            </w:r>
+            <w:r>
+              <w:rPr>
+                <w:rFonts w:ascii="Arial" w:hAnsi="Arial" w:cs="Arial"/>
+              </w:rPr>
+              <w:t>p</w:t>
+            </w:r>
+            <w:r>
+              <w:rPr>
+                <w:rFonts w:ascii="Arial" w:hAnsi="Arial" w:cs="Arial"/>
+              </w:rPr>
+              <w:t xml:space="preserve"> in </w:t>
+            </w:r>
+            <w:proofErr w:type="spellStart"/>
+            <w:r>
+              <w:rPr>
+                <w:rFonts w:ascii="Arial" w:hAnsi="Arial" w:cs="Arial"/>
+              </w:rPr>
+              <w:t>projectscore</w:t>
+            </w:r>
+            <w:proofErr w:type="spellEnd"/>
+            <w:r>
+              <w:rPr>
+                <w:rFonts w:ascii="Arial" w:hAnsi="Arial" w:cs="Arial"/>
+              </w:rPr>
+              <w:t xml:space="preserve"> </w:t>
+            </w:r>
+            <w:r>
+              <w:rPr>
+                <w:rFonts w:ascii="Arial" w:hAnsi="Arial" w:cs="Arial"/>
+              </w:rPr>
+              <w:t xml:space="preserve">%} </w:t>
+            </w:r>
+            <w:proofErr w:type="gramStart"/>
+            <w:r>
+              <w:rPr>
+                <w:rFonts w:ascii="Arial" w:hAnsi="Arial" w:cs="Arial"/>
+              </w:rPr>
+              <w:t xml:space="preserve">{{ </w:t>
+            </w:r>
+            <w:proofErr w:type="spellStart"/>
+            <w:r>
+              <w:rPr>
+                <w:rFonts w:ascii="Arial" w:hAnsi="Arial" w:cs="Arial"/>
+              </w:rPr>
+              <w:t>loop</w:t>
+            </w:r>
+            <w:proofErr w:type="gramEnd"/>
+            <w:r>
+              <w:rPr>
+                <w:rFonts w:ascii="Arial" w:hAnsi="Arial" w:cs="Arial"/>
+              </w:rPr>
+              <w:t>.index</w:t>
+            </w:r>
+            <w:proofErr w:type="spellEnd"/>
+            <w:r>
+              <w:rPr>
+                <w:rFonts w:ascii="Arial" w:hAnsi="Arial" w:cs="Arial"/>
+              </w:rPr>
+              <w:t xml:space="preserve"> }}</w:t>
             </w:r>
           </w:p>
         </w:tc>
@@ -963,27 +1419,133 @@
                 <w:bCs/>
               </w:rPr>
             </w:pPr>
-            <w:r>
-              <w:rPr>
-                <w:rFonts w:ascii="Arial" w:hAnsi="Arial" w:cs="Arial"/>
-                <w:b/>
-                <w:bCs/>
-              </w:rPr>
-              <w:t>{{ITEM 1}}</w:t>
-            </w:r>
-          </w:p>
-          <w:p>
-            <w:pPr>
-              <w:rPr>
-                <w:rFonts w:ascii="Arial" w:hAnsi="Arial" w:cs="Arial"/>
-              </w:rPr>
-            </w:pPr>
-            <w:r>
-              <w:rPr>
-                <w:rFonts w:ascii="Arial" w:hAnsi="Arial" w:cs="Arial"/>
-              </w:rPr>
-              <w:t>{{NAME}} {{DESCRIPTION OF ITEM}}</w:t>
-            </w:r>
+            <w:proofErr w:type="gramStart"/>
+            <w:r>
+              <w:rPr>
+                <w:rFonts w:ascii="Arial" w:hAnsi="Arial" w:cs="Arial"/>
+                <w:b/>
+                <w:bCs/>
+              </w:rPr>
+              <w:t xml:space="preserve">{{ </w:t>
+            </w:r>
+            <w:proofErr w:type="spellStart"/>
+            <w:r>
+              <w:rPr>
+                <w:rFonts w:ascii="Arial" w:hAnsi="Arial" w:cs="Arial"/>
+                <w:b/>
+                <w:bCs/>
+              </w:rPr>
+              <w:t>p</w:t>
+            </w:r>
+            <w:proofErr w:type="gramEnd"/>
+            <w:r>
+              <w:rPr>
+                <w:rFonts w:ascii="Arial" w:hAnsi="Arial" w:cs="Arial"/>
+                <w:b/>
+                <w:bCs/>
+              </w:rPr>
+              <w:t>.</w:t>
+            </w:r>
+            <w:proofErr w:type="gramStart"/>
+            <w:r>
+              <w:rPr>
+                <w:rFonts w:ascii="Arial" w:hAnsi="Arial" w:cs="Arial"/>
+                <w:b/>
+                <w:bCs/>
+              </w:rPr>
+              <w:t>topic</w:t>
+            </w:r>
+            <w:proofErr w:type="spellEnd"/>
+            <w:r>
+              <w:rPr>
+                <w:rFonts w:ascii="Arial" w:hAnsi="Arial" w:cs="Arial"/>
+                <w:b/>
+                <w:bCs/>
+              </w:rPr>
+              <w:t xml:space="preserve"> }</w:t>
+            </w:r>
+            <w:proofErr w:type="gramEnd"/>
+            <w:r>
+              <w:rPr>
+                <w:rFonts w:ascii="Arial" w:hAnsi="Arial" w:cs="Arial"/>
+                <w:b/>
+                <w:bCs/>
+              </w:rPr>
+              <w:t>}</w:t>
+            </w:r>
+          </w:p>
+          <w:p>
+            <w:pPr>
+              <w:rPr>
+                <w:rFonts w:ascii="Arial" w:hAnsi="Arial" w:cs="Arial"/>
+                <w:b/>
+                <w:bCs/>
+              </w:rPr>
+            </w:pPr>
+            <w:r>
+              <w:rPr>
+                <w:rFonts w:ascii="Arial" w:hAnsi="Arial" w:cs="Arial"/>
+                <w:b/>
+                <w:bCs/>
+              </w:rPr>
+              <w:br/>
+            </w:r>
+          </w:p>
+          <w:p>
+            <w:pPr>
+              <w:rPr>
+                <w:rFonts w:ascii="Arial" w:hAnsi="Arial" w:cs="Arial"/>
+              </w:rPr>
+            </w:pPr>
+            <w:proofErr w:type="gramStart"/>
+            <w:r>
+              <w:rPr>
+                <w:rFonts w:ascii="Arial" w:hAnsi="Arial" w:cs="Arial"/>
+              </w:rPr>
+              <w:t xml:space="preserve">{{ </w:t>
+            </w:r>
+            <w:proofErr w:type="spellStart"/>
+            <w:r>
+              <w:rPr>
+                <w:rFonts w:ascii="Arial" w:hAnsi="Arial" w:cs="Arial"/>
+              </w:rPr>
+              <w:t>p</w:t>
+            </w:r>
+            <w:proofErr w:type="gramEnd"/>
+            <w:r>
+              <w:rPr>
+                <w:rFonts w:ascii="Arial" w:hAnsi="Arial" w:cs="Arial"/>
+              </w:rPr>
+              <w:t>.</w:t>
+            </w:r>
+            <w:proofErr w:type="gramStart"/>
+            <w:r>
+              <w:rPr>
+                <w:rFonts w:ascii="Arial" w:hAnsi="Arial" w:cs="Arial"/>
+              </w:rPr>
+              <w:t>description</w:t>
+            </w:r>
+            <w:proofErr w:type="spellEnd"/>
+            <w:r>
+              <w:rPr>
+                <w:rFonts w:ascii="Arial" w:hAnsi="Arial" w:cs="Arial"/>
+              </w:rPr>
+              <w:t xml:space="preserve"> }</w:t>
+            </w:r>
+            <w:proofErr w:type="gramEnd"/>
+            <w:r>
+              <w:rPr>
+                <w:rFonts w:ascii="Arial" w:hAnsi="Arial" w:cs="Arial"/>
+              </w:rPr>
+              <w:t>}</w:t>
+            </w:r>
+          </w:p>
+          <w:p>
+            <w:pPr>
+              <w:rPr>
+                <w:rFonts w:ascii="Arial" w:hAnsi="Arial" w:cs="Arial"/>
+              </w:rPr>
+            </w:pPr>
           </w:p>
         </w:tc>
         <w:tc>
@@ -1094,7 +1656,79 @@
               <w:rPr>
                 <w:rFonts w:ascii="Arial" w:hAnsi="Arial" w:cs="Arial"/>
               </w:rPr>
-              <w:t>{{LIST}}</w:t>
+              <w:t xml:space="preserve">{% tr </w:t>
+            </w:r>
+            <w:proofErr w:type="gramStart"/>
+            <w:r>
+              <w:rPr>
+                <w:rFonts w:ascii="Arial" w:hAnsi="Arial" w:cs="Arial"/>
+              </w:rPr>
+              <w:t>%}{</w:t>
+            </w:r>
+            <w:proofErr w:type="gramEnd"/>
+            <w:r>
+              <w:rPr>
+                <w:rFonts w:ascii="Arial" w:hAnsi="Arial" w:cs="Arial"/>
+              </w:rPr>
+              <w:t xml:space="preserve">% for </w:t>
+            </w:r>
+            <w:r>
+              <w:rPr>
+                <w:rFonts w:ascii="Arial" w:hAnsi="Arial" w:cs="Arial"/>
+              </w:rPr>
+              <w:t>e</w:t>
+            </w:r>
+            <w:r>
+              <w:rPr>
+                <w:rFonts w:ascii="Arial" w:hAnsi="Arial" w:cs="Arial"/>
+              </w:rPr>
+              <w:t xml:space="preserve"> in </w:t>
+            </w:r>
+            <w:r>
+              <w:rPr>
+                <w:rFonts w:ascii="Arial" w:hAnsi="Arial" w:cs="Arial"/>
+              </w:rPr>
+              <w:t>endorse</w:t>
+            </w:r>
+            <w:r>
+              <w:rPr>
+                <w:rFonts w:ascii="Arial" w:hAnsi="Arial" w:cs="Arial"/>
+              </w:rPr>
+              <w:t xml:space="preserve"> </w:t>
+            </w:r>
+            <w:r>
+              <w:rPr>
+                <w:rFonts w:ascii="Arial" w:hAnsi="Arial" w:cs="Arial"/>
+              </w:rPr>
+              <w:t xml:space="preserve">%} </w:t>
+            </w:r>
+            <w:proofErr w:type="gramStart"/>
+            <w:r>
+              <w:rPr>
+                <w:rFonts w:ascii="Arial" w:hAnsi="Arial" w:cs="Arial"/>
+              </w:rPr>
+              <w:t xml:space="preserve">{{ </w:t>
+            </w:r>
+            <w:proofErr w:type="spellStart"/>
+            <w:r>
+              <w:rPr>
+                <w:rFonts w:ascii="Arial" w:hAnsi="Arial" w:cs="Arial"/>
+              </w:rPr>
+              <w:t>loop</w:t>
+            </w:r>
+            <w:proofErr w:type="gramEnd"/>
+            <w:r>
+              <w:rPr>
+                <w:rFonts w:ascii="Arial" w:hAnsi="Arial" w:cs="Arial"/>
+              </w:rPr>
+              <w:t>.index</w:t>
+            </w:r>
+            <w:proofErr w:type="spellEnd"/>
+            <w:r>
+              <w:rPr>
+                <w:rFonts w:ascii="Arial" w:hAnsi="Arial" w:cs="Arial"/>
+              </w:rPr>
+              <w:t xml:space="preserve"> }}</w:t>
             </w:r>
           </w:p>
         </w:tc>
@@ -1106,14 +1740,137 @@
             <w:pPr>
               <w:rPr>
                 <w:rFonts w:ascii="Arial" w:hAnsi="Arial" w:cs="Arial"/>
-              </w:rPr>
-            </w:pPr>
-            <w:r>
-              <w:rPr>
-                <w:rFonts w:ascii="Arial" w:hAnsi="Arial" w:cs="Arial"/>
-              </w:rPr>
-              <w:t>{{NAME}} {{DESCRIPTION OF ITEM}}</w:t>
-            </w:r>
+                <w:b/>
+                <w:bCs/>
+              </w:rPr>
+            </w:pPr>
+            <w:proofErr w:type="gramStart"/>
+            <w:r>
+              <w:rPr>
+                <w:rFonts w:ascii="Arial" w:hAnsi="Arial" w:cs="Arial"/>
+                <w:b/>
+                <w:bCs/>
+              </w:rPr>
+              <w:t xml:space="preserve">{{ </w:t>
+            </w:r>
+            <w:proofErr w:type="spellStart"/>
+            <w:r>
+              <w:rPr>
+                <w:rFonts w:ascii="Arial" w:hAnsi="Arial" w:cs="Arial"/>
+                <w:b/>
+                <w:bCs/>
+              </w:rPr>
+              <w:t>e</w:t>
+            </w:r>
+            <w:proofErr w:type="gramEnd"/>
+            <w:r>
+              <w:rPr>
+                <w:rFonts w:ascii="Arial" w:hAnsi="Arial" w:cs="Arial"/>
+                <w:b/>
+                <w:bCs/>
+              </w:rPr>
+              <w:t>.</w:t>
+            </w:r>
+            <w:proofErr w:type="gramStart"/>
+            <w:r>
+              <w:rPr>
+                <w:rFonts w:ascii="Arial" w:hAnsi="Arial" w:cs="Arial"/>
+                <w:b/>
+                <w:bCs/>
+              </w:rPr>
+              <w:t>topic</w:t>
+            </w:r>
+            <w:proofErr w:type="spellEnd"/>
+            <w:r>
+              <w:rPr>
+                <w:rFonts w:ascii="Arial" w:hAnsi="Arial" w:cs="Arial"/>
+                <w:b/>
+                <w:bCs/>
+              </w:rPr>
+              <w:t xml:space="preserve"> }</w:t>
+            </w:r>
+            <w:proofErr w:type="gramEnd"/>
+            <w:r>
+              <w:rPr>
+                <w:rFonts w:ascii="Arial" w:hAnsi="Arial" w:cs="Arial"/>
+                <w:b/>
+                <w:bCs/>
+              </w:rPr>
+              <w:t>}</w:t>
+            </w:r>
+          </w:p>
+          <w:p>
+            <w:pPr>
+              <w:rPr>
+                <w:rFonts w:ascii="Arial" w:hAnsi="Arial" w:cs="Arial"/>
+                <w:b/>
+                <w:bCs/>
+              </w:rPr>
+            </w:pPr>
+            <w:r>
+              <w:rPr>
+                <w:rFonts w:ascii="Arial" w:hAnsi="Arial" w:cs="Arial"/>
+                <w:b/>
+                <w:bCs/>
+              </w:rPr>
+              <w:br/>
+            </w:r>
+          </w:p>
+          <w:p>
+            <w:pPr>
+              <w:rPr>
+                <w:rFonts w:ascii="Arial" w:hAnsi="Arial" w:cs="Arial"/>
+              </w:rPr>
+            </w:pPr>
+            <w:proofErr w:type="gramStart"/>
+            <w:r>
+              <w:rPr>
+                <w:rFonts w:ascii="Arial" w:hAnsi="Arial" w:cs="Arial"/>
+              </w:rPr>
+              <w:t xml:space="preserve">{{ </w:t>
+            </w:r>
+            <w:proofErr w:type="spellStart"/>
+            <w:r>
+              <w:rPr>
+                <w:rFonts w:ascii="Arial" w:hAnsi="Arial" w:cs="Arial"/>
+              </w:rPr>
+              <w:t>e</w:t>
+            </w:r>
+            <w:proofErr w:type="gramEnd"/>
+            <w:r>
+              <w:rPr>
+                <w:rFonts w:ascii="Arial" w:hAnsi="Arial" w:cs="Arial"/>
+              </w:rPr>
+              <w:t>.</w:t>
+            </w:r>
+            <w:proofErr w:type="gramStart"/>
+            <w:r>
+              <w:rPr>
+                <w:rFonts w:ascii="Arial" w:hAnsi="Arial" w:cs="Arial"/>
+              </w:rPr>
+              <w:t>description</w:t>
+            </w:r>
+            <w:proofErr w:type="spellEnd"/>
+            <w:r>
+              <w:rPr>
+                <w:rFonts w:ascii="Arial" w:hAnsi="Arial" w:cs="Arial"/>
+              </w:rPr>
+              <w:t xml:space="preserve"> }</w:t>
+            </w:r>
+            <w:proofErr w:type="gramEnd"/>
+            <w:r>
+              <w:rPr>
+                <w:rFonts w:ascii="Arial" w:hAnsi="Arial" w:cs="Arial"/>
+              </w:rPr>
+              <w:t>}</w:t>
+            </w:r>
+          </w:p>
+          <w:p>
+            <w:pPr>
+              <w:rPr>
+                <w:rFonts w:ascii="Arial" w:hAnsi="Arial" w:cs="Arial"/>
+              </w:rPr>
+            </w:pPr>
           </w:p>
         </w:tc>
       </w:tr>
@@ -2017,7 +2774,6 @@
   <w:style w:type="character" w:default="1" w:styleId="DefaultParagraphFont">
     <w:name w:val="Default Paragraph Font"/>
     <w:uiPriority w:val="1"/>
-    <w:semiHidden/>
     <w:unhideWhenUsed/>
   </w:style>
   <w:style w:type="table" w:default="1" w:styleId="TableNormal">

</xml_diff>

<commit_message>
Fix word syntax issues #1
</commit_message>
<xml_diff>
--- a/MoM_Template.docx
+++ b/MoM_Template.docx
@@ -30,13 +30,103 @@
         <w:rPr>
           <w:rFonts w:ascii="Arial" w:hAnsi="Arial" w:cs="Arial"/>
         </w:rPr>
-        <w:t>{{NAME</w:t>
-      </w:r>
-      <w:r>
-        <w:rPr>
-          <w:rFonts w:ascii="Arial" w:hAnsi="Arial" w:cs="Arial"/>
-        </w:rPr>
-        <w:t xml:space="preserve"> OF MEETING}} {{TYPE OF MEETING}} </w:t>
+        <w:t>{{</w:t>
+      </w:r>
+      <w:r>
+        <w:rPr>
+          <w:rFonts w:ascii="Arial" w:hAnsi="Arial" w:cs="Arial"/>
+        </w:rPr>
+        <w:t xml:space="preserve"> </w:t>
+      </w:r>
+      <w:r>
+        <w:rPr>
+          <w:rFonts w:ascii="Arial" w:hAnsi="Arial" w:cs="Arial"/>
+        </w:rPr>
+        <w:t>NAME</w:t>
+      </w:r>
+      <w:r>
+        <w:rPr>
+          <w:rFonts w:ascii="Arial" w:hAnsi="Arial" w:cs="Arial"/>
+        </w:rPr>
+        <w:t>_</w:t>
+      </w:r>
+      <w:r>
+        <w:rPr>
+          <w:rFonts w:ascii="Arial" w:hAnsi="Arial" w:cs="Arial"/>
+        </w:rPr>
+        <w:t>OF</w:t>
+      </w:r>
+      <w:r>
+        <w:rPr>
+          <w:rFonts w:ascii="Arial" w:hAnsi="Arial" w:cs="Arial"/>
+        </w:rPr>
+        <w:t>_</w:t>
+      </w:r>
+      <w:r>
+        <w:rPr>
+          <w:rFonts w:ascii="Arial" w:hAnsi="Arial" w:cs="Arial"/>
+        </w:rPr>
+        <w:t>MEETING</w:t>
+      </w:r>
+      <w:r>
+        <w:rPr>
+          <w:rFonts w:ascii="Arial" w:hAnsi="Arial" w:cs="Arial"/>
+        </w:rPr>
+        <w:t xml:space="preserve"> </w:t>
+      </w:r>
+      <w:r>
+        <w:rPr>
+          <w:rFonts w:ascii="Arial" w:hAnsi="Arial" w:cs="Arial"/>
+        </w:rPr>
+        <w:t>}} {{</w:t>
+      </w:r>
+      <w:r>
+        <w:rPr>
+          <w:rFonts w:ascii="Arial" w:hAnsi="Arial" w:cs="Arial"/>
+        </w:rPr>
+        <w:t xml:space="preserve"> </w:t>
+      </w:r>
+      <w:r>
+        <w:rPr>
+          <w:rFonts w:ascii="Arial" w:hAnsi="Arial" w:cs="Arial"/>
+        </w:rPr>
+        <w:t>TYPE</w:t>
+      </w:r>
+      <w:r>
+        <w:rPr>
+          <w:rFonts w:ascii="Arial" w:hAnsi="Arial" w:cs="Arial"/>
+        </w:rPr>
+        <w:t>_</w:t>
+      </w:r>
+      <w:r>
+        <w:rPr>
+          <w:rFonts w:ascii="Arial" w:hAnsi="Arial" w:cs="Arial"/>
+        </w:rPr>
+        <w:t>OF</w:t>
+      </w:r>
+      <w:r>
+        <w:rPr>
+          <w:rFonts w:ascii="Arial" w:hAnsi="Arial" w:cs="Arial"/>
+        </w:rPr>
+        <w:t>_</w:t>
+      </w:r>
+      <w:r>
+        <w:rPr>
+          <w:rFonts w:ascii="Arial" w:hAnsi="Arial" w:cs="Arial"/>
+        </w:rPr>
+        <w:t>MEETING</w:t>
+      </w:r>
+      <w:r>
+        <w:rPr>
+          <w:rFonts w:ascii="Arial" w:hAnsi="Arial" w:cs="Arial"/>
+        </w:rPr>
+        <w:t xml:space="preserve"> </w:t>
+      </w:r>
+      <w:r>
+        <w:rPr>
+          <w:rFonts w:ascii="Arial" w:hAnsi="Arial" w:cs="Arial"/>
+        </w:rPr>
+        <w:t xml:space="preserve">}} </w:t>
       </w:r>
       <w:r>
         <w:rPr>
@@ -48,7 +138,43 @@
         <w:rPr>
           <w:rFonts w:ascii="Arial" w:hAnsi="Arial" w:cs="Arial"/>
         </w:rPr>
-        <w:t>{{MEETING NUMBER}}</w:t>
+        <w:t>{{</w:t>
+      </w:r>
+      <w:r>
+        <w:rPr>
+          <w:rFonts w:ascii="Arial" w:hAnsi="Arial" w:cs="Arial"/>
+        </w:rPr>
+        <w:t xml:space="preserve"> </w:t>
+      </w:r>
+      <w:r>
+        <w:rPr>
+          <w:rFonts w:ascii="Arial" w:hAnsi="Arial" w:cs="Arial"/>
+        </w:rPr>
+        <w:t>MEETING</w:t>
+      </w:r>
+      <w:r>
+        <w:rPr>
+          <w:rFonts w:ascii="Arial" w:hAnsi="Arial" w:cs="Arial"/>
+        </w:rPr>
+        <w:t>_</w:t>
+      </w:r>
+      <w:r>
+        <w:rPr>
+          <w:rFonts w:ascii="Arial" w:hAnsi="Arial" w:cs="Arial"/>
+        </w:rPr>
+        <w:t>NUMBER</w:t>
+      </w:r>
+      <w:r>
+        <w:rPr>
+          <w:rFonts w:ascii="Arial" w:hAnsi="Arial" w:cs="Arial"/>
+        </w:rPr>
+        <w:t xml:space="preserve"> </w:t>
+      </w:r>
+      <w:r>
+        <w:rPr>
+          <w:rFonts w:ascii="Arial" w:hAnsi="Arial" w:cs="Arial"/>
+        </w:rPr>
+        <w:t>}}</w:t>
       </w:r>
     </w:p>
     <w:p>
@@ -85,7 +211,79 @@
         <w:rPr>
           <w:rFonts w:ascii="Arial" w:hAnsi="Arial" w:cs="Arial"/>
         </w:rPr>
-        <w:t xml:space="preserve"> {{DAY}} {{MONTH}} {{YEAR}}</w:t>
+        <w:t xml:space="preserve"> {{</w:t>
+      </w:r>
+      <w:r>
+        <w:rPr>
+          <w:rFonts w:ascii="Arial" w:hAnsi="Arial" w:cs="Arial"/>
+        </w:rPr>
+        <w:t xml:space="preserve"> </w:t>
+      </w:r>
+      <w:r>
+        <w:rPr>
+          <w:rFonts w:ascii="Arial" w:hAnsi="Arial" w:cs="Arial"/>
+        </w:rPr>
+        <w:t>DAY</w:t>
+      </w:r>
+      <w:r>
+        <w:rPr>
+          <w:rFonts w:ascii="Arial" w:hAnsi="Arial" w:cs="Arial"/>
+        </w:rPr>
+        <w:t xml:space="preserve"> </w:t>
+      </w:r>
+      <w:r>
+        <w:rPr>
+          <w:rFonts w:ascii="Arial" w:hAnsi="Arial" w:cs="Arial"/>
+        </w:rPr>
+        <w:t>}} {{</w:t>
+      </w:r>
+      <w:r>
+        <w:rPr>
+          <w:rFonts w:ascii="Arial" w:hAnsi="Arial" w:cs="Arial"/>
+        </w:rPr>
+        <w:t xml:space="preserve"> </w:t>
+      </w:r>
+      <w:r>
+        <w:rPr>
+          <w:rFonts w:ascii="Arial" w:hAnsi="Arial" w:cs="Arial"/>
+        </w:rPr>
+        <w:t>MONTH</w:t>
+      </w:r>
+      <w:r>
+        <w:rPr>
+          <w:rFonts w:ascii="Arial" w:hAnsi="Arial" w:cs="Arial"/>
+        </w:rPr>
+        <w:t xml:space="preserve"> </w:t>
+      </w:r>
+      <w:r>
+        <w:rPr>
+          <w:rFonts w:ascii="Arial" w:hAnsi="Arial" w:cs="Arial"/>
+        </w:rPr>
+        <w:t>}} {{</w:t>
+      </w:r>
+      <w:r>
+        <w:rPr>
+          <w:rFonts w:ascii="Arial" w:hAnsi="Arial" w:cs="Arial"/>
+        </w:rPr>
+        <w:t xml:space="preserve"> </w:t>
+      </w:r>
+      <w:r>
+        <w:rPr>
+          <w:rFonts w:ascii="Arial" w:hAnsi="Arial" w:cs="Arial"/>
+        </w:rPr>
+        <w:t>YEAR</w:t>
+      </w:r>
+      <w:r>
+        <w:rPr>
+          <w:rFonts w:ascii="Arial" w:hAnsi="Arial" w:cs="Arial"/>
+        </w:rPr>
+        <w:t xml:space="preserve"> </w:t>
+      </w:r>
+      <w:r>
+        <w:rPr>
+          <w:rFonts w:ascii="Arial" w:hAnsi="Arial" w:cs="Arial"/>
+        </w:rPr>
+        <w:t>}}</w:t>
       </w:r>
     </w:p>
     <w:p>
@@ -123,25 +321,97 @@
         <w:rPr>
           <w:rFonts w:ascii="Arial" w:hAnsi="Arial" w:cs="Arial"/>
         </w:rPr>
-        <w:t xml:space="preserve">PLANNED </w:t>
-      </w:r>
-      <w:r>
-        <w:rPr>
-          <w:rFonts w:ascii="Arial" w:hAnsi="Arial" w:cs="Arial"/>
-        </w:rPr>
-        <w:t>START TIME}} – {{</w:t>
-      </w:r>
-      <w:r>
-        <w:rPr>
-          <w:rFonts w:ascii="Arial" w:hAnsi="Arial" w:cs="Arial"/>
-        </w:rPr>
-        <w:t xml:space="preserve">PLANNED </w:t>
-      </w:r>
-      <w:r>
-        <w:rPr>
-          <w:rFonts w:ascii="Arial" w:hAnsi="Arial" w:cs="Arial"/>
-        </w:rPr>
-        <w:t>END TIME}}</w:t>
+        <w:t xml:space="preserve"> </w:t>
+      </w:r>
+      <w:r>
+        <w:rPr>
+          <w:rFonts w:ascii="Arial" w:hAnsi="Arial" w:cs="Arial"/>
+        </w:rPr>
+        <w:t>PLANNED</w:t>
+      </w:r>
+      <w:r>
+        <w:rPr>
+          <w:rFonts w:ascii="Arial" w:hAnsi="Arial" w:cs="Arial"/>
+        </w:rPr>
+        <w:t>_</w:t>
+      </w:r>
+      <w:r>
+        <w:rPr>
+          <w:rFonts w:ascii="Arial" w:hAnsi="Arial" w:cs="Arial"/>
+        </w:rPr>
+        <w:t>START</w:t>
+      </w:r>
+      <w:r>
+        <w:rPr>
+          <w:rFonts w:ascii="Arial" w:hAnsi="Arial" w:cs="Arial"/>
+        </w:rPr>
+        <w:t>_</w:t>
+      </w:r>
+      <w:r>
+        <w:rPr>
+          <w:rFonts w:ascii="Arial" w:hAnsi="Arial" w:cs="Arial"/>
+        </w:rPr>
+        <w:t>TIME</w:t>
+      </w:r>
+      <w:r>
+        <w:rPr>
+          <w:rFonts w:ascii="Arial" w:hAnsi="Arial" w:cs="Arial"/>
+        </w:rPr>
+        <w:t xml:space="preserve"> </w:t>
+      </w:r>
+      <w:r>
+        <w:rPr>
+          <w:rFonts w:ascii="Arial" w:hAnsi="Arial" w:cs="Arial"/>
+        </w:rPr>
+        <w:t>}} – {{</w:t>
+      </w:r>
+      <w:r>
+        <w:rPr>
+          <w:rFonts w:ascii="Arial" w:hAnsi="Arial" w:cs="Arial"/>
+        </w:rPr>
+        <w:t xml:space="preserve"> </w:t>
+      </w:r>
+      <w:r>
+        <w:rPr>
+          <w:rFonts w:ascii="Arial" w:hAnsi="Arial" w:cs="Arial"/>
+        </w:rPr>
+        <w:t>PLANNED</w:t>
+      </w:r>
+      <w:r>
+        <w:rPr>
+          <w:rFonts w:ascii="Arial" w:hAnsi="Arial" w:cs="Arial"/>
+        </w:rPr>
+        <w:t>_</w:t>
+      </w:r>
+      <w:r>
+        <w:rPr>
+          <w:rFonts w:ascii="Arial" w:hAnsi="Arial" w:cs="Arial"/>
+        </w:rPr>
+        <w:t>END</w:t>
+      </w:r>
+      <w:r>
+        <w:rPr>
+          <w:rFonts w:ascii="Arial" w:hAnsi="Arial" w:cs="Arial"/>
+        </w:rPr>
+        <w:t>_</w:t>
+      </w:r>
+      <w:r>
+        <w:rPr>
+          <w:rFonts w:ascii="Arial" w:hAnsi="Arial" w:cs="Arial"/>
+        </w:rPr>
+        <w:t>TIME</w:t>
+      </w:r>
+      <w:r>
+        <w:rPr>
+          <w:rFonts w:ascii="Arial" w:hAnsi="Arial" w:cs="Arial"/>
+        </w:rPr>
+        <w:t xml:space="preserve"> </w:t>
+      </w:r>
+      <w:r>
+        <w:rPr>
+          <w:rFonts w:ascii="Arial" w:hAnsi="Arial" w:cs="Arial"/>
+        </w:rPr>
+        <w:t>}}</w:t>
       </w:r>
     </w:p>
     <w:p>
@@ -167,7 +437,31 @@
           <w:rFonts w:ascii="Arial" w:hAnsi="Arial" w:cs="Arial"/>
         </w:rPr>
         <w:tab/>
-        <w:t>: {{LOCATION}} or MS Teams Meeting</w:t>
+        <w:t>: {{</w:t>
+      </w:r>
+      <w:r>
+        <w:rPr>
+          <w:rFonts w:ascii="Arial" w:hAnsi="Arial" w:cs="Arial"/>
+        </w:rPr>
+        <w:t xml:space="preserve"> </w:t>
+      </w:r>
+      <w:r>
+        <w:rPr>
+          <w:rFonts w:ascii="Arial" w:hAnsi="Arial" w:cs="Arial"/>
+        </w:rPr>
+        <w:t>LOCATION</w:t>
+      </w:r>
+      <w:r>
+        <w:rPr>
+          <w:rFonts w:ascii="Arial" w:hAnsi="Arial" w:cs="Arial"/>
+        </w:rPr>
+        <w:t xml:space="preserve"> </w:t>
+      </w:r>
+      <w:r>
+        <w:rPr>
+          <w:rFonts w:ascii="Arial" w:hAnsi="Arial" w:cs="Arial"/>
+        </w:rPr>
+        <w:t>}} or MS Teams Meeting</w:t>
       </w:r>
     </w:p>
     <w:p>
@@ -297,49 +591,7 @@
               <w:rPr>
                 <w:rFonts w:ascii="Arial" w:hAnsi="Arial" w:cs="Arial"/>
               </w:rPr>
-              <w:t xml:space="preserve">{% tr </w:t>
-            </w:r>
-            <w:proofErr w:type="gramStart"/>
-            <w:r>
-              <w:rPr>
-                <w:rFonts w:ascii="Arial" w:hAnsi="Arial" w:cs="Arial"/>
-              </w:rPr>
-              <w:t>%}{</w:t>
-            </w:r>
-            <w:proofErr w:type="gramEnd"/>
-            <w:r>
-              <w:rPr>
-                <w:rFonts w:ascii="Arial" w:hAnsi="Arial" w:cs="Arial"/>
-              </w:rPr>
-              <w:t xml:space="preserve">% for a in attendees %} </w:t>
-            </w:r>
-            <w:proofErr w:type="gramStart"/>
-            <w:r>
-              <w:rPr>
-                <w:rFonts w:ascii="Arial" w:hAnsi="Arial" w:cs="Arial"/>
-              </w:rPr>
-              <w:t xml:space="preserve">{{ </w:t>
-            </w:r>
-            <w:proofErr w:type="spellStart"/>
-            <w:r>
-              <w:rPr>
-                <w:rFonts w:ascii="Arial" w:hAnsi="Arial" w:cs="Arial"/>
-              </w:rPr>
-              <w:t>loop</w:t>
-            </w:r>
-            <w:proofErr w:type="gramEnd"/>
-            <w:r>
-              <w:rPr>
-                <w:rFonts w:ascii="Arial" w:hAnsi="Arial" w:cs="Arial"/>
-              </w:rPr>
-              <w:t>.index</w:t>
-            </w:r>
-            <w:proofErr w:type="spellEnd"/>
-            <w:r>
-              <w:rPr>
-                <w:rFonts w:ascii="Arial" w:hAnsi="Arial" w:cs="Arial"/>
-              </w:rPr>
-              <w:t xml:space="preserve"> }}</w:t>
+              <w:t>{% tr %}{% for a in attendees %} {{ loop.index }}</w:t>
             </w:r>
           </w:p>
         </w:tc>
@@ -353,33 +605,11 @@
                 <w:rFonts w:ascii="Arial" w:hAnsi="Arial" w:cs="Arial"/>
               </w:rPr>
             </w:pPr>
-            <w:proofErr w:type="gramStart"/>
-            <w:r>
-              <w:rPr>
-                <w:rFonts w:ascii="Arial" w:hAnsi="Arial" w:cs="Arial"/>
-              </w:rPr>
-              <w:t xml:space="preserve">{{ </w:t>
-            </w:r>
-            <w:proofErr w:type="spellStart"/>
-            <w:r>
-              <w:rPr>
-                <w:rFonts w:ascii="Arial" w:hAnsi="Arial" w:cs="Arial"/>
-              </w:rPr>
-              <w:t>a</w:t>
-            </w:r>
-            <w:proofErr w:type="gramEnd"/>
-            <w:r>
-              <w:rPr>
-                <w:rFonts w:ascii="Arial" w:hAnsi="Arial" w:cs="Arial"/>
-              </w:rPr>
-              <w:t>.Name</w:t>
-            </w:r>
-            <w:proofErr w:type="spellEnd"/>
-            <w:r>
-              <w:rPr>
-                <w:rFonts w:ascii="Arial" w:hAnsi="Arial" w:cs="Arial"/>
-              </w:rPr>
-              <w:t xml:space="preserve"> }}</w:t>
+            <w:r>
+              <w:rPr>
+                <w:rFonts w:ascii="Arial" w:hAnsi="Arial" w:cs="Arial"/>
+              </w:rPr>
+              <w:t>{{ a.Name }}</w:t>
             </w:r>
           </w:p>
         </w:tc>
@@ -393,19 +623,11 @@
                 <w:rFonts w:ascii="Arial" w:hAnsi="Arial" w:cs="Arial"/>
               </w:rPr>
             </w:pPr>
-            <w:proofErr w:type="gramStart"/>
-            <w:r>
-              <w:rPr>
-                <w:rFonts w:ascii="Arial" w:hAnsi="Arial" w:cs="Arial"/>
-              </w:rPr>
-              <w:t>{{ a</w:t>
-            </w:r>
-            <w:proofErr w:type="gramEnd"/>
-            <w:r>
-              <w:rPr>
-                <w:rFonts w:ascii="Arial" w:hAnsi="Arial" w:cs="Arial"/>
-              </w:rPr>
-              <w:t>.Designation }}</w:t>
+            <w:r>
+              <w:rPr>
+                <w:rFonts w:ascii="Arial" w:hAnsi="Arial" w:cs="Arial"/>
+              </w:rPr>
+              <w:t>{{ a.Designation }}</w:t>
             </w:r>
           </w:p>
         </w:tc>
@@ -419,33 +641,11 @@
                 <w:rFonts w:ascii="Arial" w:hAnsi="Arial" w:cs="Arial"/>
               </w:rPr>
             </w:pPr>
-            <w:proofErr w:type="gramStart"/>
-            <w:r>
-              <w:rPr>
-                <w:rFonts w:ascii="Arial" w:hAnsi="Arial" w:cs="Arial"/>
-              </w:rPr>
-              <w:t xml:space="preserve">{{ </w:t>
-            </w:r>
-            <w:proofErr w:type="spellStart"/>
-            <w:r>
-              <w:rPr>
-                <w:rFonts w:ascii="Arial" w:hAnsi="Arial" w:cs="Arial"/>
-              </w:rPr>
-              <w:t>a</w:t>
-            </w:r>
-            <w:proofErr w:type="gramEnd"/>
-            <w:r>
-              <w:rPr>
-                <w:rFonts w:ascii="Arial" w:hAnsi="Arial" w:cs="Arial"/>
-              </w:rPr>
-              <w:t>.Abbreviation</w:t>
-            </w:r>
-            <w:proofErr w:type="spellEnd"/>
-            <w:r>
-              <w:rPr>
-                <w:rFonts w:ascii="Arial" w:hAnsi="Arial" w:cs="Arial"/>
-              </w:rPr>
-              <w:t xml:space="preserve"> }}</w:t>
+            <w:r>
+              <w:rPr>
+                <w:rFonts w:ascii="Arial" w:hAnsi="Arial" w:cs="Arial"/>
+              </w:rPr>
+              <w:t>{{ a.Abbreviation }}</w:t>
             </w:r>
           </w:p>
         </w:tc>
@@ -459,47 +659,11 @@
                 <w:rFonts w:ascii="Arial" w:hAnsi="Arial" w:cs="Arial"/>
               </w:rPr>
             </w:pPr>
-            <w:proofErr w:type="gramStart"/>
-            <w:r>
-              <w:rPr>
-                <w:rFonts w:ascii="Arial" w:hAnsi="Arial" w:cs="Arial"/>
-              </w:rPr>
-              <w:t>{{ a</w:t>
-            </w:r>
-            <w:proofErr w:type="gramEnd"/>
-            <w:r>
-              <w:rPr>
-                <w:rFonts w:ascii="Arial" w:hAnsi="Arial" w:cs="Arial"/>
-              </w:rPr>
-              <w:t>.</w:t>
-            </w:r>
-            <w:proofErr w:type="gramStart"/>
-            <w:r>
-              <w:rPr>
-                <w:rFonts w:ascii="Arial" w:hAnsi="Arial" w:cs="Arial"/>
-              </w:rPr>
-              <w:t>Attended }</w:t>
-            </w:r>
-            <w:proofErr w:type="gramEnd"/>
-            <w:r>
-              <w:rPr>
-                <w:rFonts w:ascii="Arial" w:hAnsi="Arial" w:cs="Arial"/>
-              </w:rPr>
-              <w:t xml:space="preserve">} {% endfor </w:t>
-            </w:r>
-            <w:proofErr w:type="gramStart"/>
-            <w:r>
-              <w:rPr>
-                <w:rFonts w:ascii="Arial" w:hAnsi="Arial" w:cs="Arial"/>
-              </w:rPr>
-              <w:t>%}{</w:t>
-            </w:r>
-            <w:proofErr w:type="gramEnd"/>
-            <w:r>
-              <w:rPr>
-                <w:rFonts w:ascii="Arial" w:hAnsi="Arial" w:cs="Arial"/>
-              </w:rPr>
-              <w:t>% tr %}</w:t>
+            <w:r>
+              <w:rPr>
+                <w:rFonts w:ascii="Arial" w:hAnsi="Arial" w:cs="Arial"/>
+              </w:rPr>
+              <w:t>{{ a.Attended }} {% endfor %}{% tr %}</w:t>
             </w:r>
           </w:p>
         </w:tc>
@@ -844,63 +1008,7 @@
               <w:rPr>
                 <w:rFonts w:ascii="Arial" w:hAnsi="Arial" w:cs="Arial"/>
               </w:rPr>
-              <w:t xml:space="preserve">{% tr </w:t>
-            </w:r>
-            <w:proofErr w:type="gramStart"/>
-            <w:r>
-              <w:rPr>
-                <w:rFonts w:ascii="Arial" w:hAnsi="Arial" w:cs="Arial"/>
-              </w:rPr>
-              <w:t>%}{</w:t>
-            </w:r>
-            <w:proofErr w:type="gramEnd"/>
-            <w:r>
-              <w:rPr>
-                <w:rFonts w:ascii="Arial" w:hAnsi="Arial" w:cs="Arial"/>
-              </w:rPr>
-              <w:t xml:space="preserve">% </w:t>
-            </w:r>
-            <w:proofErr w:type="spellStart"/>
-            <w:r>
-              <w:rPr>
-                <w:rFonts w:ascii="Arial" w:hAnsi="Arial" w:cs="Arial"/>
-              </w:rPr>
-              <w:t>for m</w:t>
-            </w:r>
-            <w:proofErr w:type="spellEnd"/>
-            <w:r>
-              <w:rPr>
-                <w:rFonts w:ascii="Arial" w:hAnsi="Arial" w:cs="Arial"/>
-              </w:rPr>
-              <w:t xml:space="preserve"> in matters %} </w:t>
-            </w:r>
-            <w:proofErr w:type="gramStart"/>
-            <w:r>
-              <w:rPr>
-                <w:rFonts w:ascii="Arial" w:hAnsi="Arial" w:cs="Arial"/>
-              </w:rPr>
-              <w:t xml:space="preserve">{{ </w:t>
-            </w:r>
-            <w:proofErr w:type="spellStart"/>
-            <w:r>
-              <w:rPr>
-                <w:rFonts w:ascii="Arial" w:hAnsi="Arial" w:cs="Arial"/>
-              </w:rPr>
-              <w:t>loop</w:t>
-            </w:r>
-            <w:proofErr w:type="gramEnd"/>
-            <w:r>
-              <w:rPr>
-                <w:rFonts w:ascii="Arial" w:hAnsi="Arial" w:cs="Arial"/>
-              </w:rPr>
-              <w:t>.index</w:t>
-            </w:r>
-            <w:proofErr w:type="spellEnd"/>
-            <w:r>
-              <w:rPr>
-                <w:rFonts w:ascii="Arial" w:hAnsi="Arial" w:cs="Arial"/>
-              </w:rPr>
-              <w:t xml:space="preserve"> }}</w:t>
+              <w:t>{% tr %}{% for m in matters %} {{ loop.index }}</w:t>
             </w:r>
           </w:p>
         </w:tc>
@@ -916,134 +1024,52 @@
                 <w:bCs/>
               </w:rPr>
             </w:pPr>
-            <w:proofErr w:type="gramStart"/>
             <w:r>
               <w:rPr>
                 <w:rFonts w:ascii="Arial" w:hAnsi="Arial" w:cs="Arial"/>
                 <w:b/>
                 <w:bCs/>
               </w:rPr>
-              <w:t xml:space="preserve">{{ </w:t>
-            </w:r>
-            <w:proofErr w:type="spellStart"/>
-            <w:r>
+              <w:t>{{ m.topic }}</w:t>
+            </w:r>
+          </w:p>
+          <w:p>
+            <w:pPr>
               <w:rPr>
                 <w:rFonts w:ascii="Arial" w:hAnsi="Arial" w:cs="Arial"/>
                 <w:b/>
                 <w:bCs/>
               </w:rPr>
-              <w:t>m</w:t>
-            </w:r>
-            <w:proofErr w:type="gramEnd"/>
+            </w:pPr>
             <w:r>
               <w:rPr>
                 <w:rFonts w:ascii="Arial" w:hAnsi="Arial" w:cs="Arial"/>
                 <w:b/>
                 <w:bCs/>
               </w:rPr>
-              <w:t>.</w:t>
-            </w:r>
-            <w:proofErr w:type="gramStart"/>
-            <w:r>
+              <w:br/>
+            </w:r>
+          </w:p>
+          <w:p>
+            <w:pPr>
+              <w:rPr>
+                <w:rFonts w:ascii="Arial" w:hAnsi="Arial" w:cs="Arial"/>
+              </w:rPr>
+            </w:pPr>
+            <w:r>
+              <w:rPr>
+                <w:rFonts w:ascii="Arial" w:hAnsi="Arial" w:cs="Arial"/>
+              </w:rPr>
+              <w:t>{{ m.description }}</w:t>
+            </w:r>
+          </w:p>
+          <w:p>
+            <w:pPr>
               <w:rPr>
                 <w:rFonts w:ascii="Arial" w:hAnsi="Arial" w:cs="Arial"/>
                 <w:b/>
                 <w:bCs/>
               </w:rPr>
-              <w:t>topic</w:t>
-            </w:r>
-            <w:proofErr w:type="spellEnd"/>
-            <w:r>
-              <w:rPr>
-                <w:rFonts w:ascii="Arial" w:hAnsi="Arial" w:cs="Arial"/>
-                <w:b/>
-                <w:bCs/>
-              </w:rPr>
-              <w:t xml:space="preserve"> }</w:t>
-            </w:r>
-            <w:proofErr w:type="gramEnd"/>
-            <w:r>
-              <w:rPr>
-                <w:rFonts w:ascii="Arial" w:hAnsi="Arial" w:cs="Arial"/>
-                <w:b/>
-                <w:bCs/>
-              </w:rPr>
-              <w:t>}</w:t>
-            </w:r>
-          </w:p>
-          <w:p>
-            <w:pPr>
-              <w:rPr>
-                <w:rFonts w:ascii="Arial" w:hAnsi="Arial" w:cs="Arial"/>
-                <w:b/>
-                <w:bCs/>
-              </w:rPr>
-            </w:pPr>
-            <w:r>
-              <w:rPr>
-                <w:rFonts w:ascii="Arial" w:hAnsi="Arial" w:cs="Arial"/>
-                <w:b/>
-                <w:bCs/>
-              </w:rPr>
-              <w:br/>
-            </w:r>
-          </w:p>
-          <w:p>
-            <w:pPr>
-              <w:rPr>
-                <w:rFonts w:ascii="Arial" w:hAnsi="Arial" w:cs="Arial"/>
-              </w:rPr>
-            </w:pPr>
-            <w:proofErr w:type="gramStart"/>
-            <w:r>
-              <w:rPr>
-                <w:rFonts w:ascii="Arial" w:hAnsi="Arial" w:cs="Arial"/>
-              </w:rPr>
-              <w:t xml:space="preserve">{{ </w:t>
-            </w:r>
-            <w:proofErr w:type="spellStart"/>
-            <w:r>
-              <w:rPr>
-                <w:rFonts w:ascii="Arial" w:hAnsi="Arial" w:cs="Arial"/>
-              </w:rPr>
-              <w:t>m</w:t>
-            </w:r>
-            <w:proofErr w:type="gramEnd"/>
-            <w:r>
-              <w:rPr>
-                <w:rFonts w:ascii="Arial" w:hAnsi="Arial" w:cs="Arial"/>
-              </w:rPr>
-              <w:t>.</w:t>
-            </w:r>
-            <w:proofErr w:type="gramStart"/>
-            <w:r>
-              <w:rPr>
-                <w:rFonts w:ascii="Arial" w:hAnsi="Arial" w:cs="Arial"/>
-              </w:rPr>
-              <w:t>description</w:t>
-            </w:r>
-            <w:proofErr w:type="spellEnd"/>
-            <w:r>
-              <w:rPr>
-                <w:rFonts w:ascii="Arial" w:hAnsi="Arial" w:cs="Arial"/>
-              </w:rPr>
-              <w:t xml:space="preserve"> }</w:t>
-            </w:r>
-            <w:proofErr w:type="gramEnd"/>
-            <w:r>
-              <w:rPr>
-                <w:rFonts w:ascii="Arial" w:hAnsi="Arial" w:cs="Arial"/>
-              </w:rPr>
-              <w:t>}</w:t>
-            </w:r>
-          </w:p>
-          <w:p>
-            <w:pPr>
-              <w:rPr>
-                <w:rFonts w:ascii="Arial" w:hAnsi="Arial" w:cs="Arial"/>
-                <w:b/>
-                <w:bCs/>
-              </w:rPr>
             </w:pPr>
           </w:p>
         </w:tc>
@@ -1057,33 +1083,11 @@
                 <w:rFonts w:ascii="Arial" w:hAnsi="Arial" w:cs="Arial"/>
               </w:rPr>
             </w:pPr>
-            <w:proofErr w:type="gramStart"/>
-            <w:r>
-              <w:rPr>
-                <w:rFonts w:ascii="Arial" w:hAnsi="Arial" w:cs="Arial"/>
-              </w:rPr>
-              <w:t xml:space="preserve">{{ </w:t>
-            </w:r>
-            <w:proofErr w:type="spellStart"/>
-            <w:r>
-              <w:rPr>
-                <w:rFonts w:ascii="Arial" w:hAnsi="Arial" w:cs="Arial"/>
-              </w:rPr>
-              <w:t>m</w:t>
-            </w:r>
-            <w:proofErr w:type="gramEnd"/>
-            <w:r>
-              <w:rPr>
-                <w:rFonts w:ascii="Arial" w:hAnsi="Arial" w:cs="Arial"/>
-              </w:rPr>
-              <w:t>.action_by</w:t>
-            </w:r>
-            <w:proofErr w:type="spellEnd"/>
-            <w:r>
-              <w:rPr>
-                <w:rFonts w:ascii="Arial" w:hAnsi="Arial" w:cs="Arial"/>
-              </w:rPr>
-              <w:t xml:space="preserve"> }}</w:t>
+            <w:r>
+              <w:rPr>
+                <w:rFonts w:ascii="Arial" w:hAnsi="Arial" w:cs="Arial"/>
+              </w:rPr>
+              <w:t>{{ m.action_by }}</w:t>
             </w:r>
           </w:p>
         </w:tc>
@@ -1097,33 +1101,11 @@
                 <w:rFonts w:ascii="Arial" w:hAnsi="Arial" w:cs="Arial"/>
               </w:rPr>
             </w:pPr>
-            <w:proofErr w:type="gramStart"/>
-            <w:r>
-              <w:rPr>
-                <w:rFonts w:ascii="Arial" w:hAnsi="Arial" w:cs="Arial"/>
-              </w:rPr>
-              <w:t xml:space="preserve">{{ </w:t>
-            </w:r>
-            <w:proofErr w:type="spellStart"/>
-            <w:r>
-              <w:rPr>
-                <w:rFonts w:ascii="Arial" w:hAnsi="Arial" w:cs="Arial"/>
-              </w:rPr>
-              <w:t>m</w:t>
-            </w:r>
-            <w:proofErr w:type="gramEnd"/>
-            <w:r>
-              <w:rPr>
-                <w:rFonts w:ascii="Arial" w:hAnsi="Arial" w:cs="Arial"/>
-              </w:rPr>
-              <w:t>.deadline</w:t>
-            </w:r>
-            <w:proofErr w:type="spellEnd"/>
-            <w:r>
-              <w:rPr>
-                <w:rFonts w:ascii="Arial" w:hAnsi="Arial" w:cs="Arial"/>
-              </w:rPr>
-              <w:t xml:space="preserve"> }}</w:t>
+            <w:r>
+              <w:rPr>
+                <w:rFonts w:ascii="Arial" w:hAnsi="Arial" w:cs="Arial"/>
+              </w:rPr>
+              <w:t>{{ m.deadline }}</w:t>
             </w:r>
           </w:p>
         </w:tc>
@@ -1141,77 +1123,7 @@
               <w:rPr>
                 <w:rFonts w:ascii="Arial" w:hAnsi="Arial" w:cs="Arial"/>
               </w:rPr>
-              <w:t xml:space="preserve">Status: </w:t>
-            </w:r>
-            <w:proofErr w:type="gramStart"/>
-            <w:r>
-              <w:rPr>
-                <w:rFonts w:ascii="Arial" w:hAnsi="Arial" w:cs="Arial"/>
-              </w:rPr>
-              <w:t xml:space="preserve">{{ </w:t>
-            </w:r>
-            <w:proofErr w:type="spellStart"/>
-            <w:r>
-              <w:rPr>
-                <w:rFonts w:ascii="Arial" w:hAnsi="Arial" w:cs="Arial"/>
-              </w:rPr>
-              <w:t>m</w:t>
-            </w:r>
-            <w:proofErr w:type="gramEnd"/>
-            <w:r>
-              <w:rPr>
-                <w:rFonts w:ascii="Arial" w:hAnsi="Arial" w:cs="Arial"/>
-              </w:rPr>
-              <w:t>.</w:t>
-            </w:r>
-            <w:proofErr w:type="gramStart"/>
-            <w:r>
-              <w:rPr>
-                <w:rFonts w:ascii="Arial" w:hAnsi="Arial" w:cs="Arial"/>
-              </w:rPr>
-              <w:t>status</w:t>
-            </w:r>
-            <w:proofErr w:type="spellEnd"/>
-            <w:r>
-              <w:rPr>
-                <w:rFonts w:ascii="Arial" w:hAnsi="Arial" w:cs="Arial"/>
-              </w:rPr>
-              <w:t xml:space="preserve"> }</w:t>
-            </w:r>
-            <w:proofErr w:type="gramEnd"/>
-            <w:r>
-              <w:rPr>
-                <w:rFonts w:ascii="Arial" w:hAnsi="Arial" w:cs="Arial"/>
-              </w:rPr>
-              <w:t xml:space="preserve">} {% </w:t>
-            </w:r>
-            <w:proofErr w:type="spellStart"/>
-            <w:r>
-              <w:rPr>
-                <w:rFonts w:ascii="Arial" w:hAnsi="Arial" w:cs="Arial"/>
-              </w:rPr>
-              <w:t>endfor</w:t>
-            </w:r>
-            <w:proofErr w:type="spellEnd"/>
-            <w:r>
-              <w:rPr>
-                <w:rFonts w:ascii="Arial" w:hAnsi="Arial" w:cs="Arial"/>
-              </w:rPr>
-              <w:t xml:space="preserve"> </w:t>
-            </w:r>
-            <w:proofErr w:type="gramStart"/>
-            <w:r>
-              <w:rPr>
-                <w:rFonts w:ascii="Arial" w:hAnsi="Arial" w:cs="Arial"/>
-              </w:rPr>
-              <w:t>%}{</w:t>
-            </w:r>
-            <w:proofErr w:type="gramEnd"/>
-            <w:r>
-              <w:rPr>
-                <w:rFonts w:ascii="Arial" w:hAnsi="Arial" w:cs="Arial"/>
-              </w:rPr>
-              <w:t>% tr %}</w:t>
+              <w:t>Status: {{ m.status }} {% endfor %}{% tr %}</w:t>
             </w:r>
           </w:p>
         </w:tc>
@@ -1239,352 +1151,6 @@
         </w:rPr>
         <w:lastRenderedPageBreak/>
         <w:t>3. Project Scorecard and Updates</w:t>
-      </w:r>
-    </w:p>
-    <w:tbl>
-      <w:tblPr>
-        <w:tblStyle w:val="TableGrid"/>
-        <w:tblW w:w="0" w:type="auto"/>
-        <w:tblLook w:val="04A0" w:firstRow="1" w:lastRow="0" w:firstColumn="1" w:lastColumn="0" w:noHBand="0" w:noVBand="1"/>
-      </w:tblPr>
-      <w:tblGrid>
-        <w:gridCol w:w="1745"/>
-        <w:gridCol w:w="4503"/>
-        <w:gridCol w:w="3102"/>
-      </w:tblGrid>
-      <w:tr>
-        <w:trPr>
-          <w:trHeight w:val="638"/>
-        </w:trPr>
-        <w:tc>
-          <w:tcPr>
-            <w:tcW w:w="1705" w:type="dxa"/>
-          </w:tcPr>
-          <w:p>
-            <w:pPr>
-              <w:rPr>
-                <w:rFonts w:ascii="Arial" w:hAnsi="Arial" w:cs="Arial"/>
-              </w:rPr>
-            </w:pPr>
-            <w:r>
-              <w:rPr>
-                <w:rFonts w:ascii="Arial" w:hAnsi="Arial" w:cs="Arial"/>
-              </w:rPr>
-              <w:t>No.</w:t>
-            </w:r>
-          </w:p>
-        </w:tc>
-        <w:tc>
-          <w:tcPr>
-            <w:tcW w:w="4515" w:type="dxa"/>
-          </w:tcPr>
-          <w:p>
-            <w:pPr>
-              <w:rPr>
-                <w:rFonts w:ascii="Arial" w:hAnsi="Arial" w:cs="Arial"/>
-              </w:rPr>
-            </w:pPr>
-            <w:r>
-              <w:rPr>
-                <w:rFonts w:ascii="Arial" w:hAnsi="Arial" w:cs="Arial"/>
-              </w:rPr>
-              <w:t>Project Scorecard and Updates</w:t>
-            </w:r>
-          </w:p>
-        </w:tc>
-        <w:tc>
-          <w:tcPr>
-            <w:tcW w:w="3110" w:type="dxa"/>
-          </w:tcPr>
-          <w:p>
-            <w:pPr>
-              <w:rPr>
-                <w:rFonts w:ascii="Arial" w:hAnsi="Arial" w:cs="Arial"/>
-              </w:rPr>
-            </w:pPr>
-            <w:r>
-              <w:rPr>
-                <w:rFonts w:ascii="Arial" w:hAnsi="Arial" w:cs="Arial"/>
-              </w:rPr>
-              <w:t>Action</w:t>
-            </w:r>
-          </w:p>
-        </w:tc>
-      </w:tr>
-      <w:tr>
-        <w:trPr>
-          <w:trHeight w:val="638"/>
-        </w:trPr>
-        <w:tc>
-          <w:tcPr>
-            <w:tcW w:w="1705" w:type="dxa"/>
-          </w:tcPr>
-          <w:p>
-            <w:pPr>
-              <w:rPr>
-                <w:rFonts w:ascii="Arial" w:hAnsi="Arial" w:cs="Arial"/>
-              </w:rPr>
-            </w:pPr>
-            <w:r>
-              <w:rPr>
-                <w:rFonts w:ascii="Arial" w:hAnsi="Arial" w:cs="Arial"/>
-              </w:rPr>
-              <w:t xml:space="preserve">{% tr </w:t>
-            </w:r>
-            <w:proofErr w:type="gramStart"/>
-            <w:r>
-              <w:rPr>
-                <w:rFonts w:ascii="Arial" w:hAnsi="Arial" w:cs="Arial"/>
-              </w:rPr>
-              <w:t>%}{</w:t>
-            </w:r>
-            <w:proofErr w:type="gramEnd"/>
-            <w:r>
-              <w:rPr>
-                <w:rFonts w:ascii="Arial" w:hAnsi="Arial" w:cs="Arial"/>
-              </w:rPr>
-              <w:t xml:space="preserve">% for </w:t>
-            </w:r>
-            <w:r>
-              <w:rPr>
-                <w:rFonts w:ascii="Arial" w:hAnsi="Arial" w:cs="Arial"/>
-              </w:rPr>
-              <w:t>p</w:t>
-            </w:r>
-            <w:r>
-              <w:rPr>
-                <w:rFonts w:ascii="Arial" w:hAnsi="Arial" w:cs="Arial"/>
-              </w:rPr>
-              <w:t xml:space="preserve"> in </w:t>
-            </w:r>
-            <w:proofErr w:type="spellStart"/>
-            <w:r>
-              <w:rPr>
-                <w:rFonts w:ascii="Arial" w:hAnsi="Arial" w:cs="Arial"/>
-              </w:rPr>
-              <w:t>projectscore</w:t>
-            </w:r>
-            <w:proofErr w:type="spellEnd"/>
-            <w:r>
-              <w:rPr>
-                <w:rFonts w:ascii="Arial" w:hAnsi="Arial" w:cs="Arial"/>
-              </w:rPr>
-              <w:t xml:space="preserve"> </w:t>
-            </w:r>
-            <w:r>
-              <w:rPr>
-                <w:rFonts w:ascii="Arial" w:hAnsi="Arial" w:cs="Arial"/>
-              </w:rPr>
-              <w:t xml:space="preserve">%} </w:t>
-            </w:r>
-            <w:proofErr w:type="gramStart"/>
-            <w:r>
-              <w:rPr>
-                <w:rFonts w:ascii="Arial" w:hAnsi="Arial" w:cs="Arial"/>
-              </w:rPr>
-              <w:t xml:space="preserve">{{ </w:t>
-            </w:r>
-            <w:proofErr w:type="spellStart"/>
-            <w:r>
-              <w:rPr>
-                <w:rFonts w:ascii="Arial" w:hAnsi="Arial" w:cs="Arial"/>
-              </w:rPr>
-              <w:t>loop</w:t>
-            </w:r>
-            <w:proofErr w:type="gramEnd"/>
-            <w:r>
-              <w:rPr>
-                <w:rFonts w:ascii="Arial" w:hAnsi="Arial" w:cs="Arial"/>
-              </w:rPr>
-              <w:t>.index</w:t>
-            </w:r>
-            <w:proofErr w:type="spellEnd"/>
-            <w:r>
-              <w:rPr>
-                <w:rFonts w:ascii="Arial" w:hAnsi="Arial" w:cs="Arial"/>
-              </w:rPr>
-              <w:t xml:space="preserve"> }}</w:t>
-            </w:r>
-          </w:p>
-        </w:tc>
-        <w:tc>
-          <w:tcPr>
-            <w:tcW w:w="4515" w:type="dxa"/>
-          </w:tcPr>
-          <w:p>
-            <w:pPr>
-              <w:rPr>
-                <w:rFonts w:ascii="Arial" w:hAnsi="Arial" w:cs="Arial"/>
-                <w:b/>
-                <w:bCs/>
-              </w:rPr>
-            </w:pPr>
-            <w:proofErr w:type="gramStart"/>
-            <w:r>
-              <w:rPr>
-                <w:rFonts w:ascii="Arial" w:hAnsi="Arial" w:cs="Arial"/>
-                <w:b/>
-                <w:bCs/>
-              </w:rPr>
-              <w:t xml:space="preserve">{{ </w:t>
-            </w:r>
-            <w:proofErr w:type="spellStart"/>
-            <w:r>
-              <w:rPr>
-                <w:rFonts w:ascii="Arial" w:hAnsi="Arial" w:cs="Arial"/>
-                <w:b/>
-                <w:bCs/>
-              </w:rPr>
-              <w:t>p</w:t>
-            </w:r>
-            <w:proofErr w:type="gramEnd"/>
-            <w:r>
-              <w:rPr>
-                <w:rFonts w:ascii="Arial" w:hAnsi="Arial" w:cs="Arial"/>
-                <w:b/>
-                <w:bCs/>
-              </w:rPr>
-              <w:t>.</w:t>
-            </w:r>
-            <w:proofErr w:type="gramStart"/>
-            <w:r>
-              <w:rPr>
-                <w:rFonts w:ascii="Arial" w:hAnsi="Arial" w:cs="Arial"/>
-                <w:b/>
-                <w:bCs/>
-              </w:rPr>
-              <w:t>topic</w:t>
-            </w:r>
-            <w:proofErr w:type="spellEnd"/>
-            <w:r>
-              <w:rPr>
-                <w:rFonts w:ascii="Arial" w:hAnsi="Arial" w:cs="Arial"/>
-                <w:b/>
-                <w:bCs/>
-              </w:rPr>
-              <w:t xml:space="preserve"> }</w:t>
-            </w:r>
-            <w:proofErr w:type="gramEnd"/>
-            <w:r>
-              <w:rPr>
-                <w:rFonts w:ascii="Arial" w:hAnsi="Arial" w:cs="Arial"/>
-                <w:b/>
-                <w:bCs/>
-              </w:rPr>
-              <w:t>}</w:t>
-            </w:r>
-          </w:p>
-          <w:p>
-            <w:pPr>
-              <w:rPr>
-                <w:rFonts w:ascii="Arial" w:hAnsi="Arial" w:cs="Arial"/>
-                <w:b/>
-                <w:bCs/>
-              </w:rPr>
-            </w:pPr>
-            <w:r>
-              <w:rPr>
-                <w:rFonts w:ascii="Arial" w:hAnsi="Arial" w:cs="Arial"/>
-                <w:b/>
-                <w:bCs/>
-              </w:rPr>
-              <w:br/>
-            </w:r>
-          </w:p>
-          <w:p>
-            <w:pPr>
-              <w:rPr>
-                <w:rFonts w:ascii="Arial" w:hAnsi="Arial" w:cs="Arial"/>
-              </w:rPr>
-            </w:pPr>
-            <w:proofErr w:type="gramStart"/>
-            <w:r>
-              <w:rPr>
-                <w:rFonts w:ascii="Arial" w:hAnsi="Arial" w:cs="Arial"/>
-              </w:rPr>
-              <w:t xml:space="preserve">{{ </w:t>
-            </w:r>
-            <w:proofErr w:type="spellStart"/>
-            <w:r>
-              <w:rPr>
-                <w:rFonts w:ascii="Arial" w:hAnsi="Arial" w:cs="Arial"/>
-              </w:rPr>
-              <w:t>p</w:t>
-            </w:r>
-            <w:proofErr w:type="gramEnd"/>
-            <w:r>
-              <w:rPr>
-                <w:rFonts w:ascii="Arial" w:hAnsi="Arial" w:cs="Arial"/>
-              </w:rPr>
-              <w:t>.</w:t>
-            </w:r>
-            <w:proofErr w:type="gramStart"/>
-            <w:r>
-              <w:rPr>
-                <w:rFonts w:ascii="Arial" w:hAnsi="Arial" w:cs="Arial"/>
-              </w:rPr>
-              <w:t>description</w:t>
-            </w:r>
-            <w:proofErr w:type="spellEnd"/>
-            <w:r>
-              <w:rPr>
-                <w:rFonts w:ascii="Arial" w:hAnsi="Arial" w:cs="Arial"/>
-              </w:rPr>
-              <w:t xml:space="preserve"> }</w:t>
-            </w:r>
-            <w:proofErr w:type="gramEnd"/>
-            <w:r>
-              <w:rPr>
-                <w:rFonts w:ascii="Arial" w:hAnsi="Arial" w:cs="Arial"/>
-              </w:rPr>
-              <w:t>}</w:t>
-            </w:r>
-          </w:p>
-          <w:p>
-            <w:pPr>
-              <w:rPr>
-                <w:rFonts w:ascii="Arial" w:hAnsi="Arial" w:cs="Arial"/>
-              </w:rPr>
-            </w:pPr>
-          </w:p>
-        </w:tc>
-        <w:tc>
-          <w:tcPr>
-            <w:tcW w:w="3110" w:type="dxa"/>
-          </w:tcPr>
-          <w:p>
-            <w:pPr>
-              <w:rPr>
-                <w:rFonts w:ascii="Arial" w:hAnsi="Arial" w:cs="Arial"/>
-              </w:rPr>
-            </w:pPr>
-            <w:r>
-              <w:rPr>
-                <w:rFonts w:ascii="Arial" w:hAnsi="Arial" w:cs="Arial"/>
-              </w:rPr>
-              <w:t>Noted on Information</w:t>
-            </w:r>
-          </w:p>
-        </w:tc>
-      </w:tr>
-    </w:tbl>
-    <w:p/>
-    <w:p>
-      <w:r>
-        <w:rPr>
-          <w:rFonts w:ascii="Arial" w:hAnsi="Arial" w:cs="Arial"/>
-          <w:b/>
-          <w:bCs/>
-        </w:rPr>
-        <w:t xml:space="preserve">4. </w:t>
-      </w:r>
-      <w:r>
-        <w:rPr>
-          <w:rFonts w:ascii="Arial" w:hAnsi="Arial" w:cs="Arial"/>
-          <w:b/>
-          <w:bCs/>
-        </w:rPr>
-        <w:t>Matter(s) for Management Endorsement</w:t>
       </w:r>
     </w:p>
     <w:tbl>
@@ -1595,7 +1161,217 @@
       </w:tblPr>
       <w:tblGrid>
         <w:gridCol w:w="1705"/>
-        <w:gridCol w:w="7609"/>
+        <w:gridCol w:w="4515"/>
+        <w:gridCol w:w="3110"/>
+      </w:tblGrid>
+      <w:tr>
+        <w:trPr>
+          <w:trHeight w:val="638"/>
+        </w:trPr>
+        <w:tc>
+          <w:tcPr>
+            <w:tcW w:w="1705" w:type="dxa"/>
+          </w:tcPr>
+          <w:p>
+            <w:pPr>
+              <w:rPr>
+                <w:rFonts w:ascii="Arial" w:hAnsi="Arial" w:cs="Arial"/>
+              </w:rPr>
+            </w:pPr>
+            <w:r>
+              <w:rPr>
+                <w:rFonts w:ascii="Arial" w:hAnsi="Arial" w:cs="Arial"/>
+              </w:rPr>
+              <w:t>No.</w:t>
+            </w:r>
+          </w:p>
+        </w:tc>
+        <w:tc>
+          <w:tcPr>
+            <w:tcW w:w="4515" w:type="dxa"/>
+          </w:tcPr>
+          <w:p>
+            <w:pPr>
+              <w:rPr>
+                <w:rFonts w:ascii="Arial" w:hAnsi="Arial" w:cs="Arial"/>
+              </w:rPr>
+            </w:pPr>
+            <w:r>
+              <w:rPr>
+                <w:rFonts w:ascii="Arial" w:hAnsi="Arial" w:cs="Arial"/>
+              </w:rPr>
+              <w:t>Project Scorecard and Updates</w:t>
+            </w:r>
+          </w:p>
+        </w:tc>
+        <w:tc>
+          <w:tcPr>
+            <w:tcW w:w="3110" w:type="dxa"/>
+          </w:tcPr>
+          <w:p>
+            <w:pPr>
+              <w:rPr>
+                <w:rFonts w:ascii="Arial" w:hAnsi="Arial" w:cs="Arial"/>
+              </w:rPr>
+            </w:pPr>
+            <w:r>
+              <w:rPr>
+                <w:rFonts w:ascii="Arial" w:hAnsi="Arial" w:cs="Arial"/>
+              </w:rPr>
+              <w:t>Action</w:t>
+            </w:r>
+          </w:p>
+        </w:tc>
+      </w:tr>
+      <w:tr>
+        <w:trPr>
+          <w:trHeight w:val="638"/>
+        </w:trPr>
+        <w:tc>
+          <w:tcPr>
+            <w:tcW w:w="1705" w:type="dxa"/>
+          </w:tcPr>
+          <w:p>
+            <w:pPr>
+              <w:rPr>
+                <w:rFonts w:ascii="Arial" w:hAnsi="Arial" w:cs="Arial"/>
+              </w:rPr>
+            </w:pPr>
+            <w:r>
+              <w:rPr>
+                <w:rFonts w:ascii="Arial" w:hAnsi="Arial" w:cs="Arial"/>
+              </w:rPr>
+              <w:t>{% tr %}{% for s in scorecards %} {{ loop.index }}</w:t>
+            </w:r>
+          </w:p>
+        </w:tc>
+        <w:tc>
+          <w:tcPr>
+            <w:tcW w:w="4515" w:type="dxa"/>
+          </w:tcPr>
+          <w:p>
+            <w:pPr>
+              <w:rPr>
+                <w:rFonts w:ascii="Arial" w:hAnsi="Arial" w:cs="Arial"/>
+                <w:b/>
+                <w:bCs/>
+              </w:rPr>
+            </w:pPr>
+            <w:r>
+              <w:rPr>
+                <w:rFonts w:ascii="Arial" w:hAnsi="Arial" w:cs="Arial"/>
+                <w:b/>
+                <w:bCs/>
+              </w:rPr>
+              <w:t xml:space="preserve">{{ </w:t>
+            </w:r>
+            <w:r>
+              <w:rPr>
+                <w:rFonts w:ascii="Arial" w:hAnsi="Arial" w:cs="Arial"/>
+                <w:b/>
+                <w:bCs/>
+              </w:rPr>
+              <w:t>s</w:t>
+            </w:r>
+            <w:r>
+              <w:rPr>
+                <w:rFonts w:ascii="Arial" w:hAnsi="Arial" w:cs="Arial"/>
+                <w:b/>
+                <w:bCs/>
+              </w:rPr>
+              <w:t>.topic }}</w:t>
+            </w:r>
+          </w:p>
+          <w:p>
+            <w:pPr>
+              <w:rPr>
+                <w:rFonts w:ascii="Arial" w:hAnsi="Arial" w:cs="Arial"/>
+                <w:b/>
+                <w:bCs/>
+              </w:rPr>
+            </w:pPr>
+            <w:r>
+              <w:rPr>
+                <w:rFonts w:ascii="Arial" w:hAnsi="Arial" w:cs="Arial"/>
+                <w:b/>
+                <w:bCs/>
+              </w:rPr>
+              <w:br/>
+            </w:r>
+          </w:p>
+          <w:p>
+            <w:pPr>
+              <w:rPr>
+                <w:rFonts w:ascii="Arial" w:hAnsi="Arial" w:cs="Arial"/>
+              </w:rPr>
+            </w:pPr>
+            <w:r>
+              <w:rPr>
+                <w:rFonts w:ascii="Arial" w:hAnsi="Arial" w:cs="Arial"/>
+              </w:rPr>
+              <w:t xml:space="preserve">{{ </w:t>
+            </w:r>
+            <w:r>
+              <w:rPr>
+                <w:rFonts w:ascii="Arial" w:hAnsi="Arial" w:cs="Arial"/>
+              </w:rPr>
+              <w:t>s</w:t>
+            </w:r>
+            <w:r>
+              <w:rPr>
+                <w:rFonts w:ascii="Arial" w:hAnsi="Arial" w:cs="Arial"/>
+              </w:rPr>
+              <w:t>.description }}</w:t>
+            </w:r>
+          </w:p>
+          <w:p>
+            <w:pPr>
+              <w:rPr>
+                <w:rFonts w:ascii="Arial" w:hAnsi="Arial" w:cs="Arial"/>
+              </w:rPr>
+            </w:pPr>
+          </w:p>
+        </w:tc>
+        <w:tc>
+          <w:tcPr>
+            <w:tcW w:w="3110" w:type="dxa"/>
+          </w:tcPr>
+          <w:p>
+            <w:pPr>
+              <w:rPr>
+                <w:rFonts w:ascii="Arial" w:hAnsi="Arial" w:cs="Arial"/>
+              </w:rPr>
+            </w:pPr>
+            <w:r>
+              <w:rPr>
+                <w:rFonts w:ascii="Arial" w:hAnsi="Arial" w:cs="Arial"/>
+              </w:rPr>
+              <w:t>Noted on Information {% endfor %}{% tr %}</w:t>
+            </w:r>
+          </w:p>
+        </w:tc>
+      </w:tr>
+    </w:tbl>
+    <w:p/>
+    <w:p>
+      <w:r>
+        <w:rPr>
+          <w:rFonts w:ascii="Arial" w:hAnsi="Arial" w:cs="Arial"/>
+          <w:b/>
+          <w:bCs/>
+        </w:rPr>
+        <w:t>4. Matter(s) for Management Endorsement</w:t>
+      </w:r>
+    </w:p>
+    <w:tbl>
+      <w:tblPr>
+        <w:tblStyle w:val="TableGrid"/>
+        <w:tblW w:w="0" w:type="auto"/>
+        <w:tblLook w:val="04A0" w:firstRow="1" w:lastRow="0" w:firstColumn="1" w:lastColumn="0" w:noHBand="0" w:noVBand="1"/>
+      </w:tblPr>
+      <w:tblGrid>
+        <w:gridCol w:w="1941"/>
+        <w:gridCol w:w="7409"/>
       </w:tblGrid>
       <w:tr>
         <w:trPr>
@@ -1656,79 +1432,7 @@
               <w:rPr>
                 <w:rFonts w:ascii="Arial" w:hAnsi="Arial" w:cs="Arial"/>
               </w:rPr>
-              <w:t xml:space="preserve">{% tr </w:t>
-            </w:r>
-            <w:proofErr w:type="gramStart"/>
-            <w:r>
-              <w:rPr>
-                <w:rFonts w:ascii="Arial" w:hAnsi="Arial" w:cs="Arial"/>
-              </w:rPr>
-              <w:t>%}{</w:t>
-            </w:r>
-            <w:proofErr w:type="gramEnd"/>
-            <w:r>
-              <w:rPr>
-                <w:rFonts w:ascii="Arial" w:hAnsi="Arial" w:cs="Arial"/>
-              </w:rPr>
-              <w:t xml:space="preserve">% for </w:t>
-            </w:r>
-            <w:r>
-              <w:rPr>
-                <w:rFonts w:ascii="Arial" w:hAnsi="Arial" w:cs="Arial"/>
-              </w:rPr>
-              <w:t>e</w:t>
-            </w:r>
-            <w:r>
-              <w:rPr>
-                <w:rFonts w:ascii="Arial" w:hAnsi="Arial" w:cs="Arial"/>
-              </w:rPr>
-              <w:t xml:space="preserve"> in </w:t>
-            </w:r>
-            <w:r>
-              <w:rPr>
-                <w:rFonts w:ascii="Arial" w:hAnsi="Arial" w:cs="Arial"/>
-              </w:rPr>
-              <w:t>endorse</w:t>
-            </w:r>
-            <w:r>
-              <w:rPr>
-                <w:rFonts w:ascii="Arial" w:hAnsi="Arial" w:cs="Arial"/>
-              </w:rPr>
-              <w:t xml:space="preserve"> </w:t>
-            </w:r>
-            <w:r>
-              <w:rPr>
-                <w:rFonts w:ascii="Arial" w:hAnsi="Arial" w:cs="Arial"/>
-              </w:rPr>
-              <w:t xml:space="preserve">%} </w:t>
-            </w:r>
-            <w:proofErr w:type="gramStart"/>
-            <w:r>
-              <w:rPr>
-                <w:rFonts w:ascii="Arial" w:hAnsi="Arial" w:cs="Arial"/>
-              </w:rPr>
-              <w:t xml:space="preserve">{{ </w:t>
-            </w:r>
-            <w:proofErr w:type="spellStart"/>
-            <w:r>
-              <w:rPr>
-                <w:rFonts w:ascii="Arial" w:hAnsi="Arial" w:cs="Arial"/>
-              </w:rPr>
-              <w:t>loop</w:t>
-            </w:r>
-            <w:proofErr w:type="gramEnd"/>
-            <w:r>
-              <w:rPr>
-                <w:rFonts w:ascii="Arial" w:hAnsi="Arial" w:cs="Arial"/>
-              </w:rPr>
-              <w:t>.index</w:t>
-            </w:r>
-            <w:proofErr w:type="spellEnd"/>
-            <w:r>
-              <w:rPr>
-                <w:rFonts w:ascii="Arial" w:hAnsi="Arial" w:cs="Arial"/>
-              </w:rPr>
-              <w:t xml:space="preserve"> }}</w:t>
+              <w:t>{% tr %}{% for e in endorsements %} {{ loop.index }}</w:t>
             </w:r>
           </w:p>
         </w:tc>
@@ -1740,137 +1444,14 @@
             <w:pPr>
               <w:rPr>
                 <w:rFonts w:ascii="Arial" w:hAnsi="Arial" w:cs="Arial"/>
-                <w:b/>
-                <w:bCs/>
-              </w:rPr>
-            </w:pPr>
-            <w:proofErr w:type="gramStart"/>
-            <w:r>
-              <w:rPr>
-                <w:rFonts w:ascii="Arial" w:hAnsi="Arial" w:cs="Arial"/>
-                <w:b/>
-                <w:bCs/>
-              </w:rPr>
-              <w:t xml:space="preserve">{{ </w:t>
-            </w:r>
-            <w:proofErr w:type="spellStart"/>
-            <w:r>
-              <w:rPr>
-                <w:rFonts w:ascii="Arial" w:hAnsi="Arial" w:cs="Arial"/>
-                <w:b/>
-                <w:bCs/>
-              </w:rPr>
-              <w:t>e</w:t>
-            </w:r>
-            <w:proofErr w:type="gramEnd"/>
-            <w:r>
-              <w:rPr>
-                <w:rFonts w:ascii="Arial" w:hAnsi="Arial" w:cs="Arial"/>
-                <w:b/>
-                <w:bCs/>
-              </w:rPr>
-              <w:t>.</w:t>
-            </w:r>
-            <w:proofErr w:type="gramStart"/>
-            <w:r>
-              <w:rPr>
-                <w:rFonts w:ascii="Arial" w:hAnsi="Arial" w:cs="Arial"/>
-                <w:b/>
-                <w:bCs/>
-              </w:rPr>
-              <w:t>topic</w:t>
-            </w:r>
-            <w:proofErr w:type="spellEnd"/>
-            <w:r>
-              <w:rPr>
-                <w:rFonts w:ascii="Arial" w:hAnsi="Arial" w:cs="Arial"/>
-                <w:b/>
-                <w:bCs/>
-              </w:rPr>
-              <w:t xml:space="preserve"> }</w:t>
-            </w:r>
-            <w:proofErr w:type="gramEnd"/>
-            <w:r>
-              <w:rPr>
-                <w:rFonts w:ascii="Arial" w:hAnsi="Arial" w:cs="Arial"/>
-                <w:b/>
-                <w:bCs/>
-              </w:rPr>
-              <w:t>}</w:t>
-            </w:r>
-          </w:p>
-          <w:p>
-            <w:pPr>
-              <w:rPr>
-                <w:rFonts w:ascii="Arial" w:hAnsi="Arial" w:cs="Arial"/>
-                <w:b/>
-                <w:bCs/>
-              </w:rPr>
-            </w:pPr>
-            <w:r>
-              <w:rPr>
-                <w:rFonts w:ascii="Arial" w:hAnsi="Arial" w:cs="Arial"/>
-                <w:b/>
-                <w:bCs/>
-              </w:rPr>
-              <w:br/>
-            </w:r>
-          </w:p>
-          <w:p>
-            <w:pPr>
-              <w:rPr>
-                <w:rFonts w:ascii="Arial" w:hAnsi="Arial" w:cs="Arial"/>
-              </w:rPr>
-            </w:pPr>
-            <w:proofErr w:type="gramStart"/>
-            <w:r>
-              <w:rPr>
-                <w:rFonts w:ascii="Arial" w:hAnsi="Arial" w:cs="Arial"/>
-              </w:rPr>
-              <w:t xml:space="preserve">{{ </w:t>
-            </w:r>
-            <w:proofErr w:type="spellStart"/>
-            <w:r>
-              <w:rPr>
-                <w:rFonts w:ascii="Arial" w:hAnsi="Arial" w:cs="Arial"/>
-              </w:rPr>
-              <w:t>e</w:t>
-            </w:r>
-            <w:proofErr w:type="gramEnd"/>
-            <w:r>
-              <w:rPr>
-                <w:rFonts w:ascii="Arial" w:hAnsi="Arial" w:cs="Arial"/>
-              </w:rPr>
-              <w:t>.</w:t>
-            </w:r>
-            <w:proofErr w:type="gramStart"/>
-            <w:r>
-              <w:rPr>
-                <w:rFonts w:ascii="Arial" w:hAnsi="Arial" w:cs="Arial"/>
-              </w:rPr>
-              <w:t>description</w:t>
-            </w:r>
-            <w:proofErr w:type="spellEnd"/>
-            <w:r>
-              <w:rPr>
-                <w:rFonts w:ascii="Arial" w:hAnsi="Arial" w:cs="Arial"/>
-              </w:rPr>
-              <w:t xml:space="preserve"> }</w:t>
-            </w:r>
-            <w:proofErr w:type="gramEnd"/>
-            <w:r>
-              <w:rPr>
-                <w:rFonts w:ascii="Arial" w:hAnsi="Arial" w:cs="Arial"/>
-              </w:rPr>
-              <w:t>}</w:t>
-            </w:r>
-          </w:p>
-          <w:p>
-            <w:pPr>
-              <w:rPr>
-                <w:rFonts w:ascii="Arial" w:hAnsi="Arial" w:cs="Arial"/>
-              </w:rPr>
-            </w:pPr>
+              </w:rPr>
+            </w:pPr>
+            <w:r>
+              <w:rPr>
+                <w:rFonts w:ascii="Arial" w:hAnsi="Arial" w:cs="Arial"/>
+              </w:rPr>
+              <w:t>{{ e.description }} {% endfor %}{% tr %}</w:t>
+            </w:r>
           </w:p>
         </w:tc>
       </w:tr>
@@ -1895,48 +1476,84 @@
       <w:pPr>
         <w:rPr>
           <w:rFonts w:ascii="Arial" w:hAnsi="Arial" w:cs="Arial"/>
-          <w:b/>
-          <w:bCs/>
         </w:rPr>
       </w:pPr>
       <w:r>
         <w:rPr>
           <w:rFonts w:ascii="Arial" w:hAnsi="Arial" w:cs="Arial"/>
         </w:rPr>
-        <w:t>{{MEETING NAME}} {{MEETING TYPE}} {{MEETING NUMBER}} adjourned at {{</w:t>
-      </w:r>
-      <w:r>
-        <w:rPr>
-          <w:rFonts w:ascii="Arial" w:hAnsi="Arial" w:cs="Arial"/>
-        </w:rPr>
-        <w:t xml:space="preserve">ACTUAL </w:t>
-      </w:r>
-      <w:r>
-        <w:rPr>
-          <w:rFonts w:ascii="Arial" w:hAnsi="Arial" w:cs="Arial"/>
-        </w:rPr>
-        <w:t>END TIME}}</w:t>
-      </w:r>
-      <w:r>
-        <w:rPr>
-          <w:rFonts w:ascii="Arial" w:hAnsi="Arial" w:cs="Arial"/>
-          <w:b/>
-          <w:bCs/>
-        </w:rPr>
-        <w:t xml:space="preserve"> </w:t>
+        <w:t>{{ NAME_OF_MEETING }} {{ TYPE_OF_MEETING }} Meeting {{ MEETING_NUMBER }}</w:t>
       </w:r>
     </w:p>
     <w:p>
       <w:pPr>
         <w:rPr>
           <w:rFonts w:ascii="Arial" w:hAnsi="Arial" w:cs="Arial"/>
+          <w:b/>
+          <w:bCs/>
         </w:rPr>
       </w:pPr>
       <w:r>
         <w:rPr>
           <w:rFonts w:ascii="Arial" w:hAnsi="Arial" w:cs="Arial"/>
         </w:rPr>
-        <w:t>Prepared By: {{NAME}}</w:t>
+        <w:t xml:space="preserve"> adjourned at {{</w:t>
+      </w:r>
+      <w:r>
+        <w:rPr>
+          <w:rFonts w:ascii="Arial" w:hAnsi="Arial" w:cs="Arial"/>
+        </w:rPr>
+        <w:t xml:space="preserve"> </w:t>
+      </w:r>
+      <w:r>
+        <w:rPr>
+          <w:rFonts w:ascii="Arial" w:hAnsi="Arial" w:cs="Arial"/>
+        </w:rPr>
+        <w:t>ACTUAL</w:t>
+      </w:r>
+      <w:r>
+        <w:rPr>
+          <w:rFonts w:ascii="Arial" w:hAnsi="Arial" w:cs="Arial"/>
+        </w:rPr>
+        <w:t>_</w:t>
+      </w:r>
+      <w:r>
+        <w:rPr>
+          <w:rFonts w:ascii="Arial" w:hAnsi="Arial" w:cs="Arial"/>
+        </w:rPr>
+        <w:t>END</w:t>
+      </w:r>
+      <w:r>
+        <w:rPr>
+          <w:rFonts w:ascii="Arial" w:hAnsi="Arial" w:cs="Arial"/>
+        </w:rPr>
+        <w:t>_</w:t>
+      </w:r>
+      <w:r>
+        <w:rPr>
+          <w:rFonts w:ascii="Arial" w:hAnsi="Arial" w:cs="Arial"/>
+        </w:rPr>
+        <w:t>TIME</w:t>
+      </w:r>
+      <w:r>
+        <w:rPr>
+          <w:rFonts w:ascii="Arial" w:hAnsi="Arial" w:cs="Arial"/>
+        </w:rPr>
+        <w:t xml:space="preserve"> </w:t>
+      </w:r>
+      <w:r>
+        <w:rPr>
+          <w:rFonts w:ascii="Arial" w:hAnsi="Arial" w:cs="Arial"/>
+        </w:rPr>
+        <w:t>}}</w:t>
+      </w:r>
+      <w:r>
+        <w:rPr>
+          <w:rFonts w:ascii="Arial" w:hAnsi="Arial" w:cs="Arial"/>
+          <w:b/>
+          <w:bCs/>
+        </w:rPr>
+        <w:t xml:space="preserve"> </w:t>
       </w:r>
     </w:p>
     <w:p>
@@ -1949,13 +1566,50 @@
         <w:rPr>
           <w:rFonts w:ascii="Arial" w:hAnsi="Arial" w:cs="Arial"/>
         </w:rPr>
+        <w:t>Prepared By: {{</w:t>
+      </w:r>
+      <w:r>
+        <w:rPr>
+          <w:rFonts w:ascii="Arial" w:hAnsi="Arial" w:cs="Arial"/>
+        </w:rPr>
+        <w:t xml:space="preserve"> </w:t>
+      </w:r>
+      <w:r>
+        <w:rPr>
+          <w:rFonts w:ascii="Arial" w:hAnsi="Arial" w:cs="Arial"/>
+        </w:rPr>
+        <w:t xml:space="preserve">PREPARED_BY </w:t>
+      </w:r>
+      <w:r>
+        <w:rPr>
+          <w:rFonts w:ascii="Arial" w:hAnsi="Arial" w:cs="Arial"/>
+        </w:rPr>
+        <w:t>}}</w:t>
+      </w:r>
+    </w:p>
+    <w:p>
+      <w:pPr>
+        <w:rPr>
+          <w:rFonts w:ascii="Arial" w:hAnsi="Arial" w:cs="Arial"/>
+        </w:rPr>
+      </w:pPr>
+      <w:r>
+        <w:rPr>
+          <w:rFonts w:ascii="Arial" w:hAnsi="Arial" w:cs="Arial"/>
+        </w:rPr>
         <w:t>REVIEWED BY: {{</w:t>
       </w:r>
       <w:r>
         <w:rPr>
           <w:rFonts w:ascii="Arial" w:hAnsi="Arial" w:cs="Arial"/>
         </w:rPr>
-        <w:t>NAME</w:t>
+        <w:t xml:space="preserve"> </w:t>
+      </w:r>
+      <w:r>
+        <w:rPr>
+          <w:rFonts w:ascii="Arial" w:hAnsi="Arial" w:cs="Arial"/>
+        </w:rPr>
+        <w:t xml:space="preserve">REVIEWED_BY </w:t>
       </w:r>
       <w:r>
         <w:rPr>
@@ -2058,7 +1712,6 @@
               <w:rPr>
                 <w:b/>
                 <w:bCs/>
-                <w:noProof/>
               </w:rPr>
               <w:t>2</w:t>
             </w:r>
@@ -2103,7 +1756,6 @@
               <w:rPr>
                 <w:b/>
                 <w:bCs/>
-                <w:noProof/>
               </w:rPr>
               <w:t>2</w:t>
             </w:r>
@@ -2165,7 +1817,73 @@
       <w:jc w:val="right"/>
     </w:pPr>
     <w:r>
-      <w:t>MEETING MINUTES – {{NAME OF MEETING}} {{TYPE OF MEETING}} {{MEETING NUMBER}}</w:t>
+      <w:t>MEETING MINUTES – {{</w:t>
+    </w:r>
+    <w:r>
+      <w:t xml:space="preserve"> </w:t>
+    </w:r>
+    <w:r>
+      <w:t>NAME</w:t>
+    </w:r>
+    <w:r>
+      <w:t>_</w:t>
+    </w:r>
+    <w:r>
+      <w:t>OF</w:t>
+    </w:r>
+    <w:r>
+      <w:t>_</w:t>
+    </w:r>
+    <w:r>
+      <w:t>MEETING</w:t>
+    </w:r>
+    <w:r>
+      <w:t xml:space="preserve"> </w:t>
+    </w:r>
+    <w:r>
+      <w:t>}} {{</w:t>
+    </w:r>
+    <w:r>
+      <w:t xml:space="preserve"> </w:t>
+    </w:r>
+    <w:r>
+      <w:t>TYPE</w:t>
+    </w:r>
+    <w:r>
+      <w:t>_</w:t>
+    </w:r>
+    <w:r>
+      <w:t>OF</w:t>
+    </w:r>
+    <w:r>
+      <w:t>_</w:t>
+    </w:r>
+    <w:r>
+      <w:t>MEETING</w:t>
+    </w:r>
+    <w:r>
+      <w:t xml:space="preserve"> </w:t>
+    </w:r>
+    <w:r>
+      <w:t>}} {{</w:t>
+    </w:r>
+    <w:r>
+      <w:t xml:space="preserve"> </w:t>
+    </w:r>
+    <w:r>
+      <w:t>MEETING</w:t>
+    </w:r>
+    <w:r>
+      <w:t>_</w:t>
+    </w:r>
+    <w:r>
+      <w:t>NUMBER</w:t>
+    </w:r>
+    <w:r>
+      <w:t xml:space="preserve"> </w:t>
+    </w:r>
+    <w:r>
+      <w:t>}}</w:t>
     </w:r>
   </w:p>
 </w:hdr>
@@ -2571,6 +2289,9 @@
   <w:style w:type="paragraph" w:default="1" w:styleId="Normal">
     <w:name w:val="Normal"/>
     <w:qFormat/>
+    <w:rPr>
+      <w:noProof/>
+    </w:rPr>
   </w:style>
   <w:style w:type="paragraph" w:styleId="Heading1">
     <w:name w:val="heading 1"/>
@@ -2774,6 +2495,7 @@
   <w:style w:type="character" w:default="1" w:styleId="DefaultParagraphFont">
     <w:name w:val="Default Paragraph Font"/>
     <w:uiPriority w:val="1"/>
+    <w:semiHidden/>
     <w:unhideWhenUsed/>
   </w:style>
   <w:style w:type="table" w:default="1" w:styleId="TableNormal">

</xml_diff>

<commit_message>
Include debug.py (fixes jinja2 formatting), and update docx syntax
</commit_message>
<xml_diff>
--- a/MoM_Template.docx
+++ b/MoM_Template.docx
@@ -487,7 +487,7 @@
       <w:tr>
         <w:tc>
           <w:tcPr>
-            <w:tcW w:w="1870" w:type="dxa"/>
+            <w:tcW w:w="1796" w:type="dxa"/>
           </w:tcPr>
           <w:p>
             <w:pPr>
@@ -505,7 +505,7 @@
         </w:tc>
         <w:tc>
           <w:tcPr>
-            <w:tcW w:w="1870" w:type="dxa"/>
+            <w:tcW w:w="1722" w:type="dxa"/>
           </w:tcPr>
           <w:p>
             <w:pPr>
@@ -523,7 +523,7 @@
         </w:tc>
         <w:tc>
           <w:tcPr>
-            <w:tcW w:w="1870" w:type="dxa"/>
+            <w:tcW w:w="1978" w:type="dxa"/>
           </w:tcPr>
           <w:p>
             <w:pPr>
@@ -541,7 +541,7 @@
         </w:tc>
         <w:tc>
           <w:tcPr>
-            <w:tcW w:w="1870" w:type="dxa"/>
+            <w:tcW w:w="2039" w:type="dxa"/>
           </w:tcPr>
           <w:p>
             <w:pPr>
@@ -559,7 +559,7 @@
         </w:tc>
         <w:tc>
           <w:tcPr>
-            <w:tcW w:w="1870" w:type="dxa"/>
+            <w:tcW w:w="1815" w:type="dxa"/>
           </w:tcPr>
           <w:p>
             <w:pPr>
@@ -579,221 +579,221 @@
       <w:tr>
         <w:tc>
           <w:tcPr>
-            <w:tcW w:w="1870" w:type="dxa"/>
-          </w:tcPr>
-          <w:p>
-            <w:pPr>
-              <w:rPr>
-                <w:rFonts w:ascii="Arial" w:hAnsi="Arial" w:cs="Arial"/>
-              </w:rPr>
-            </w:pPr>
-            <w:r>
-              <w:rPr>
-                <w:rFonts w:ascii="Arial" w:hAnsi="Arial" w:cs="Arial"/>
-              </w:rPr>
-              <w:t>{% tr %}{% for a in attendees %} {{ loop.index }}</w:t>
-            </w:r>
-          </w:p>
-        </w:tc>
-        <w:tc>
-          <w:tcPr>
-            <w:tcW w:w="1870" w:type="dxa"/>
-          </w:tcPr>
-          <w:p>
-            <w:pPr>
-              <w:rPr>
-                <w:rFonts w:ascii="Arial" w:hAnsi="Arial" w:cs="Arial"/>
-              </w:rPr>
-            </w:pPr>
-            <w:r>
-              <w:rPr>
-                <w:rFonts w:ascii="Arial" w:hAnsi="Arial" w:cs="Arial"/>
-              </w:rPr>
-              <w:t>{{ a.Name }}</w:t>
-            </w:r>
-          </w:p>
-        </w:tc>
-        <w:tc>
-          <w:tcPr>
-            <w:tcW w:w="1870" w:type="dxa"/>
-          </w:tcPr>
-          <w:p>
-            <w:pPr>
-              <w:rPr>
-                <w:rFonts w:ascii="Arial" w:hAnsi="Arial" w:cs="Arial"/>
-              </w:rPr>
-            </w:pPr>
-            <w:r>
-              <w:rPr>
-                <w:rFonts w:ascii="Arial" w:hAnsi="Arial" w:cs="Arial"/>
-              </w:rPr>
-              <w:t>{{ a.Designation }}</w:t>
-            </w:r>
-          </w:p>
-        </w:tc>
-        <w:tc>
-          <w:tcPr>
-            <w:tcW w:w="1870" w:type="dxa"/>
-          </w:tcPr>
-          <w:p>
-            <w:pPr>
-              <w:rPr>
-                <w:rFonts w:ascii="Arial" w:hAnsi="Arial" w:cs="Arial"/>
-              </w:rPr>
-            </w:pPr>
-            <w:r>
-              <w:rPr>
-                <w:rFonts w:ascii="Arial" w:hAnsi="Arial" w:cs="Arial"/>
-              </w:rPr>
-              <w:t>{{ a.Abbreviation }}</w:t>
-            </w:r>
-          </w:p>
-        </w:tc>
-        <w:tc>
-          <w:tcPr>
-            <w:tcW w:w="1870" w:type="dxa"/>
-          </w:tcPr>
-          <w:p>
-            <w:pPr>
-              <w:rPr>
-                <w:rFonts w:ascii="Arial" w:hAnsi="Arial" w:cs="Arial"/>
-              </w:rPr>
-            </w:pPr>
-            <w:r>
-              <w:rPr>
-                <w:rFonts w:ascii="Arial" w:hAnsi="Arial" w:cs="Arial"/>
-              </w:rPr>
-              <w:t>{{ a.Attended }} {%</w:t>
-            </w:r>
-            <w:r>
-              <w:rPr>
-                <w:rFonts w:ascii="Arial" w:hAnsi="Arial" w:cs="Arial"/>
-              </w:rPr>
-              <w:t>tr</w:t>
-            </w:r>
-            <w:r>
-              <w:rPr>
-                <w:rFonts w:ascii="Arial" w:hAnsi="Arial" w:cs="Arial"/>
-              </w:rPr>
-              <w:t xml:space="preserve"> endfor %}{% tr %}</w:t>
-            </w:r>
+            <w:tcW w:w="1796" w:type="dxa"/>
+          </w:tcPr>
+          <w:p>
+            <w:pPr>
+              <w:rPr>
+                <w:rFonts w:ascii="Arial" w:hAnsi="Arial" w:cs="Arial"/>
+              </w:rPr>
+            </w:pPr>
+            <w:r>
+              <w:rPr>
+                <w:rFonts w:ascii="Arial" w:hAnsi="Arial" w:cs="Arial"/>
+              </w:rPr>
+              <w:t>{%tr for a in attendees %}</w:t>
+            </w:r>
+          </w:p>
+        </w:tc>
+        <w:tc>
+          <w:tcPr>
+            <w:tcW w:w="1722" w:type="dxa"/>
+          </w:tcPr>
+          <w:p>
+            <w:pPr>
+              <w:rPr>
+                <w:rFonts w:ascii="Arial" w:hAnsi="Arial" w:cs="Arial"/>
+              </w:rPr>
+            </w:pPr>
+          </w:p>
+        </w:tc>
+        <w:tc>
+          <w:tcPr>
+            <w:tcW w:w="1978" w:type="dxa"/>
+          </w:tcPr>
+          <w:p>
+            <w:pPr>
+              <w:rPr>
+                <w:rFonts w:ascii="Arial" w:hAnsi="Arial" w:cs="Arial"/>
+              </w:rPr>
+            </w:pPr>
+          </w:p>
+        </w:tc>
+        <w:tc>
+          <w:tcPr>
+            <w:tcW w:w="2039" w:type="dxa"/>
+          </w:tcPr>
+          <w:p>
+            <w:pPr>
+              <w:rPr>
+                <w:rFonts w:ascii="Arial" w:hAnsi="Arial" w:cs="Arial"/>
+              </w:rPr>
+            </w:pPr>
+          </w:p>
+        </w:tc>
+        <w:tc>
+          <w:tcPr>
+            <w:tcW w:w="1815" w:type="dxa"/>
+          </w:tcPr>
+          <w:p>
+            <w:pPr>
+              <w:rPr>
+                <w:rFonts w:ascii="Arial" w:hAnsi="Arial" w:cs="Arial"/>
+              </w:rPr>
+            </w:pPr>
           </w:p>
         </w:tc>
       </w:tr>
       <w:tr>
         <w:tc>
           <w:tcPr>
-            <w:tcW w:w="1870" w:type="dxa"/>
-          </w:tcPr>
-          <w:p>
-            <w:pPr>
-              <w:rPr>
-                <w:rFonts w:ascii="Arial" w:hAnsi="Arial" w:cs="Arial"/>
-              </w:rPr>
-            </w:pPr>
-          </w:p>
-        </w:tc>
-        <w:tc>
-          <w:tcPr>
-            <w:tcW w:w="1870" w:type="dxa"/>
-          </w:tcPr>
-          <w:p>
-            <w:pPr>
-              <w:rPr>
-                <w:rFonts w:ascii="Arial" w:hAnsi="Arial" w:cs="Arial"/>
-              </w:rPr>
-            </w:pPr>
-          </w:p>
-        </w:tc>
-        <w:tc>
-          <w:tcPr>
-            <w:tcW w:w="1870" w:type="dxa"/>
-          </w:tcPr>
-          <w:p>
-            <w:pPr>
-              <w:rPr>
-                <w:rFonts w:ascii="Arial" w:hAnsi="Arial" w:cs="Arial"/>
-              </w:rPr>
-            </w:pPr>
-          </w:p>
-        </w:tc>
-        <w:tc>
-          <w:tcPr>
-            <w:tcW w:w="1870" w:type="dxa"/>
-          </w:tcPr>
-          <w:p>
-            <w:pPr>
-              <w:rPr>
-                <w:rFonts w:ascii="Arial" w:hAnsi="Arial" w:cs="Arial"/>
-              </w:rPr>
-            </w:pPr>
-          </w:p>
-        </w:tc>
-        <w:tc>
-          <w:tcPr>
-            <w:tcW w:w="1870" w:type="dxa"/>
-          </w:tcPr>
-          <w:p>
-            <w:pPr>
-              <w:rPr>
-                <w:rFonts w:ascii="Arial" w:hAnsi="Arial" w:cs="Arial"/>
-              </w:rPr>
-            </w:pPr>
+            <w:tcW w:w="1796" w:type="dxa"/>
+          </w:tcPr>
+          <w:p>
+            <w:pPr>
+              <w:rPr>
+                <w:rFonts w:ascii="Arial" w:hAnsi="Arial" w:cs="Arial"/>
+              </w:rPr>
+            </w:pPr>
+            <w:r>
+              <w:rPr>
+                <w:rFonts w:ascii="Arial" w:hAnsi="Arial" w:cs="Arial"/>
+              </w:rPr>
+              <w:t>{{ loop.index }}</w:t>
+            </w:r>
+          </w:p>
+        </w:tc>
+        <w:tc>
+          <w:tcPr>
+            <w:tcW w:w="1722" w:type="dxa"/>
+          </w:tcPr>
+          <w:p>
+            <w:pPr>
+              <w:rPr>
+                <w:rFonts w:ascii="Arial" w:hAnsi="Arial" w:cs="Arial"/>
+              </w:rPr>
+            </w:pPr>
+            <w:r>
+              <w:rPr>
+                <w:rFonts w:ascii="Arial" w:hAnsi="Arial" w:cs="Arial"/>
+              </w:rPr>
+              <w:t>{{ a.Name }}</w:t>
+            </w:r>
+          </w:p>
+        </w:tc>
+        <w:tc>
+          <w:tcPr>
+            <w:tcW w:w="1978" w:type="dxa"/>
+          </w:tcPr>
+          <w:p>
+            <w:pPr>
+              <w:rPr>
+                <w:rFonts w:ascii="Arial" w:hAnsi="Arial" w:cs="Arial"/>
+              </w:rPr>
+            </w:pPr>
+            <w:r>
+              <w:rPr>
+                <w:rFonts w:ascii="Arial" w:hAnsi="Arial" w:cs="Arial"/>
+              </w:rPr>
+              <w:t>{{ a.Designation }}</w:t>
+            </w:r>
+          </w:p>
+        </w:tc>
+        <w:tc>
+          <w:tcPr>
+            <w:tcW w:w="2039" w:type="dxa"/>
+          </w:tcPr>
+          <w:p>
+            <w:pPr>
+              <w:rPr>
+                <w:rFonts w:ascii="Arial" w:hAnsi="Arial" w:cs="Arial"/>
+              </w:rPr>
+            </w:pPr>
+            <w:r>
+              <w:rPr>
+                <w:rFonts w:ascii="Arial" w:hAnsi="Arial" w:cs="Arial"/>
+              </w:rPr>
+              <w:t>{{ a.Abbreviation }}</w:t>
+            </w:r>
+          </w:p>
+        </w:tc>
+        <w:tc>
+          <w:tcPr>
+            <w:tcW w:w="1815" w:type="dxa"/>
+          </w:tcPr>
+          <w:p>
+            <w:pPr>
+              <w:rPr>
+                <w:rFonts w:ascii="Arial" w:hAnsi="Arial" w:cs="Arial"/>
+              </w:rPr>
+            </w:pPr>
+            <w:r>
+              <w:rPr>
+                <w:rFonts w:ascii="Arial" w:hAnsi="Arial" w:cs="Arial"/>
+              </w:rPr>
+              <w:t xml:space="preserve">{{ a.Attended }} </w:t>
+            </w:r>
           </w:p>
         </w:tc>
       </w:tr>
       <w:tr>
         <w:tc>
           <w:tcPr>
-            <w:tcW w:w="1870" w:type="dxa"/>
-          </w:tcPr>
-          <w:p>
-            <w:pPr>
-              <w:rPr>
-                <w:rFonts w:ascii="Arial" w:hAnsi="Arial" w:cs="Arial"/>
-              </w:rPr>
-            </w:pPr>
-          </w:p>
-        </w:tc>
-        <w:tc>
-          <w:tcPr>
-            <w:tcW w:w="1870" w:type="dxa"/>
-          </w:tcPr>
-          <w:p>
-            <w:pPr>
-              <w:rPr>
-                <w:rFonts w:ascii="Arial" w:hAnsi="Arial" w:cs="Arial"/>
-              </w:rPr>
-            </w:pPr>
-          </w:p>
-        </w:tc>
-        <w:tc>
-          <w:tcPr>
-            <w:tcW w:w="1870" w:type="dxa"/>
-          </w:tcPr>
-          <w:p>
-            <w:pPr>
-              <w:rPr>
-                <w:rFonts w:ascii="Arial" w:hAnsi="Arial" w:cs="Arial"/>
-              </w:rPr>
-            </w:pPr>
-          </w:p>
-        </w:tc>
-        <w:tc>
-          <w:tcPr>
-            <w:tcW w:w="1870" w:type="dxa"/>
-          </w:tcPr>
-          <w:p>
-            <w:pPr>
-              <w:rPr>
-                <w:rFonts w:ascii="Arial" w:hAnsi="Arial" w:cs="Arial"/>
-              </w:rPr>
-            </w:pPr>
-          </w:p>
-        </w:tc>
-        <w:tc>
-          <w:tcPr>
-            <w:tcW w:w="1870" w:type="dxa"/>
+            <w:tcW w:w="1796" w:type="dxa"/>
+          </w:tcPr>
+          <w:p>
+            <w:pPr>
+              <w:rPr>
+                <w:rFonts w:ascii="Arial" w:hAnsi="Arial" w:cs="Arial"/>
+              </w:rPr>
+            </w:pPr>
+            <w:r>
+              <w:rPr>
+                <w:rFonts w:ascii="Arial" w:hAnsi="Arial" w:cs="Arial"/>
+              </w:rPr>
+              <w:t>{%tr endfor %}</w:t>
+            </w:r>
+          </w:p>
+        </w:tc>
+        <w:tc>
+          <w:tcPr>
+            <w:tcW w:w="1722" w:type="dxa"/>
+          </w:tcPr>
+          <w:p>
+            <w:pPr>
+              <w:rPr>
+                <w:rFonts w:ascii="Arial" w:hAnsi="Arial" w:cs="Arial"/>
+              </w:rPr>
+            </w:pPr>
+          </w:p>
+        </w:tc>
+        <w:tc>
+          <w:tcPr>
+            <w:tcW w:w="1978" w:type="dxa"/>
+          </w:tcPr>
+          <w:p>
+            <w:pPr>
+              <w:rPr>
+                <w:rFonts w:ascii="Arial" w:hAnsi="Arial" w:cs="Arial"/>
+              </w:rPr>
+            </w:pPr>
+          </w:p>
+        </w:tc>
+        <w:tc>
+          <w:tcPr>
+            <w:tcW w:w="2039" w:type="dxa"/>
+          </w:tcPr>
+          <w:p>
+            <w:pPr>
+              <w:rPr>
+                <w:rFonts w:ascii="Arial" w:hAnsi="Arial" w:cs="Arial"/>
+              </w:rPr>
+            </w:pPr>
+          </w:p>
+        </w:tc>
+        <w:tc>
+          <w:tcPr>
+            <w:tcW w:w="1815" w:type="dxa"/>
           </w:tcPr>
           <w:p>
             <w:pPr>
@@ -847,7 +847,13 @@
         <w:rPr>
           <w:rFonts w:ascii="Arial" w:hAnsi="Arial" w:cs="Arial"/>
         </w:rPr>
-        <w:t xml:space="preserve">{{NAME}} welcomes everyone to </w:t>
+        <w:t>NAME</w:t>
+      </w:r>
+      <w:r>
+        <w:rPr>
+          <w:rFonts w:ascii="Arial" w:hAnsi="Arial" w:cs="Arial"/>
+        </w:rPr>
+        <w:t xml:space="preserve"> welcomes everyone to </w:t>
       </w:r>
       <w:r>
         <w:rPr>
@@ -859,7 +865,61 @@
         <w:rPr>
           <w:rFonts w:ascii="Arial" w:hAnsi="Arial" w:cs="Arial"/>
         </w:rPr>
-        <w:t>{MEETING NAME}} {{MEETING TYPE}} {{MEETING NUMBER}}.</w:t>
+        <w:t>{</w:t>
+      </w:r>
+      <w:r>
+        <w:rPr>
+          <w:rFonts w:ascii="Arial" w:hAnsi="Arial" w:cs="Arial"/>
+        </w:rPr>
+        <w:t xml:space="preserve"> </w:t>
+      </w:r>
+      <w:r>
+        <w:rPr>
+          <w:rFonts w:ascii="Arial" w:hAnsi="Arial" w:cs="Arial"/>
+        </w:rPr>
+        <w:t xml:space="preserve">NAME_OF_MEETING </w:t>
+      </w:r>
+      <w:r>
+        <w:rPr>
+          <w:rFonts w:ascii="Arial" w:hAnsi="Arial" w:cs="Arial"/>
+        </w:rPr>
+        <w:t>}} {{</w:t>
+      </w:r>
+      <w:r>
+        <w:rPr>
+          <w:rFonts w:ascii="Arial" w:hAnsi="Arial" w:cs="Arial"/>
+        </w:rPr>
+        <w:t xml:space="preserve"> </w:t>
+      </w:r>
+      <w:r>
+        <w:rPr>
+          <w:rFonts w:ascii="Arial" w:hAnsi="Arial" w:cs="Arial"/>
+        </w:rPr>
+        <w:t xml:space="preserve">TYPE_OF_MEETING </w:t>
+      </w:r>
+      <w:r>
+        <w:rPr>
+          <w:rFonts w:ascii="Arial" w:hAnsi="Arial" w:cs="Arial"/>
+        </w:rPr>
+        <w:t>}} {{</w:t>
+      </w:r>
+      <w:r>
+        <w:rPr>
+          <w:rFonts w:ascii="Arial" w:hAnsi="Arial" w:cs="Arial"/>
+        </w:rPr>
+        <w:t xml:space="preserve"> </w:t>
+      </w:r>
+      <w:r>
+        <w:rPr>
+          <w:rFonts w:ascii="Arial" w:hAnsi="Arial" w:cs="Arial"/>
+        </w:rPr>
+        <w:t xml:space="preserve">MEETING_NUMBER </w:t>
+      </w:r>
+      <w:r>
+        <w:rPr>
+          <w:rFonts w:ascii="Arial" w:hAnsi="Arial" w:cs="Arial"/>
+        </w:rPr>
+        <w:t>}}.</w:t>
       </w:r>
     </w:p>
     <w:p>
@@ -907,7 +967,7 @@
         </w:trPr>
         <w:tc>
           <w:tcPr>
-            <w:tcW w:w="1870" w:type="dxa"/>
+            <w:tcW w:w="1845" w:type="dxa"/>
           </w:tcPr>
           <w:p>
             <w:pPr>
@@ -925,7 +985,7 @@
         </w:tc>
         <w:tc>
           <w:tcPr>
-            <w:tcW w:w="1870" w:type="dxa"/>
+            <w:tcW w:w="1941" w:type="dxa"/>
           </w:tcPr>
           <w:p>
             <w:pPr>
@@ -943,7 +1003,7 @@
         </w:tc>
         <w:tc>
           <w:tcPr>
-            <w:tcW w:w="1870" w:type="dxa"/>
+            <w:tcW w:w="1865" w:type="dxa"/>
           </w:tcPr>
           <w:p>
             <w:pPr>
@@ -961,7 +1021,7 @@
         </w:tc>
         <w:tc>
           <w:tcPr>
-            <w:tcW w:w="1870" w:type="dxa"/>
+            <w:tcW w:w="1853" w:type="dxa"/>
           </w:tcPr>
           <w:p>
             <w:pPr>
@@ -979,7 +1039,7 @@
         </w:tc>
         <w:tc>
           <w:tcPr>
-            <w:tcW w:w="1870" w:type="dxa"/>
+            <w:tcW w:w="1846" w:type="dxa"/>
           </w:tcPr>
           <w:p>
             <w:pPr>
@@ -1008,25 +1068,25 @@
         </w:trPr>
         <w:tc>
           <w:tcPr>
-            <w:tcW w:w="1870" w:type="dxa"/>
-          </w:tcPr>
-          <w:p>
-            <w:pPr>
-              <w:rPr>
-                <w:rFonts w:ascii="Arial" w:hAnsi="Arial" w:cs="Arial"/>
-              </w:rPr>
-            </w:pPr>
-            <w:r>
-              <w:rPr>
-                <w:rFonts w:ascii="Arial" w:hAnsi="Arial" w:cs="Arial"/>
-              </w:rPr>
-              <w:t>{% tr %}{% for m in matters %} {{ loop.index }}</w:t>
-            </w:r>
-          </w:p>
-        </w:tc>
-        <w:tc>
-          <w:tcPr>
-            <w:tcW w:w="1870" w:type="dxa"/>
+            <w:tcW w:w="1845" w:type="dxa"/>
+          </w:tcPr>
+          <w:p>
+            <w:pPr>
+              <w:rPr>
+                <w:rFonts w:ascii="Arial" w:hAnsi="Arial" w:cs="Arial"/>
+              </w:rPr>
+            </w:pPr>
+            <w:r>
+              <w:rPr>
+                <w:rFonts w:ascii="Arial" w:hAnsi="Arial" w:cs="Arial"/>
+              </w:rPr>
+              <w:t>{%tr for m in matters %}</w:t>
+            </w:r>
+          </w:p>
+        </w:tc>
+        <w:tc>
+          <w:tcPr>
+            <w:tcW w:w="1941" w:type="dxa"/>
           </w:tcPr>
           <w:p>
             <w:pPr>
@@ -1036,58 +1096,127 @@
                 <w:bCs/>
               </w:rPr>
             </w:pPr>
-            <w:r>
+          </w:p>
+        </w:tc>
+        <w:tc>
+          <w:tcPr>
+            <w:tcW w:w="1865" w:type="dxa"/>
+          </w:tcPr>
+          <w:p>
+            <w:pPr>
+              <w:rPr>
+                <w:rFonts w:ascii="Arial" w:hAnsi="Arial" w:cs="Arial"/>
+              </w:rPr>
+            </w:pPr>
+          </w:p>
+        </w:tc>
+        <w:tc>
+          <w:tcPr>
+            <w:tcW w:w="1853" w:type="dxa"/>
+          </w:tcPr>
+          <w:p>
+            <w:pPr>
+              <w:rPr>
+                <w:rFonts w:ascii="Arial" w:hAnsi="Arial" w:cs="Arial"/>
+              </w:rPr>
+            </w:pPr>
+          </w:p>
+        </w:tc>
+        <w:tc>
+          <w:tcPr>
+            <w:tcW w:w="1846" w:type="dxa"/>
+          </w:tcPr>
+          <w:p>
+            <w:pPr>
+              <w:rPr>
+                <w:rFonts w:ascii="Arial" w:hAnsi="Arial" w:cs="Arial"/>
+              </w:rPr>
+            </w:pPr>
+          </w:p>
+        </w:tc>
+      </w:tr>
+      <w:tr>
+        <w:trPr>
+          <w:trHeight w:val="890"/>
+        </w:trPr>
+        <w:tc>
+          <w:tcPr>
+            <w:tcW w:w="1845" w:type="dxa"/>
+          </w:tcPr>
+          <w:p>
+            <w:pPr>
+              <w:rPr>
+                <w:rFonts w:ascii="Arial" w:hAnsi="Arial" w:cs="Arial"/>
+              </w:rPr>
+            </w:pPr>
+            <w:r>
+              <w:rPr>
+                <w:rFonts w:ascii="Arial" w:hAnsi="Arial" w:cs="Arial"/>
+              </w:rPr>
+              <w:t>{{ loop.index }}</w:t>
+            </w:r>
+          </w:p>
+        </w:tc>
+        <w:tc>
+          <w:tcPr>
+            <w:tcW w:w="1941" w:type="dxa"/>
+          </w:tcPr>
+          <w:p>
+            <w:pPr>
+              <w:rPr>
+                <w:rFonts w:ascii="Arial" w:hAnsi="Arial" w:cs="Arial"/>
+              </w:rPr>
+            </w:pPr>
+            <w:r>
+              <w:rPr>
+                <w:rFonts w:ascii="Arial" w:hAnsi="Arial" w:cs="Arial"/>
+              </w:rPr>
+              <w:t>{{ m.topic }}</w:t>
+            </w:r>
+          </w:p>
+          <w:p>
+            <w:pPr>
               <w:rPr>
                 <w:rFonts w:ascii="Arial" w:hAnsi="Arial" w:cs="Arial"/>
                 <w:b/>
                 <w:bCs/>
               </w:rPr>
-              <w:t>{{ m.topic }}</w:t>
-            </w:r>
-          </w:p>
-          <w:p>
-            <w:pPr>
+            </w:pPr>
+            <w:r>
               <w:rPr>
                 <w:rFonts w:ascii="Arial" w:hAnsi="Arial" w:cs="Arial"/>
                 <w:b/>
                 <w:bCs/>
               </w:rPr>
-            </w:pPr>
-            <w:r>
+              <w:br/>
+            </w:r>
+          </w:p>
+          <w:p>
+            <w:pPr>
+              <w:rPr>
+                <w:rFonts w:ascii="Arial" w:hAnsi="Arial" w:cs="Arial"/>
+              </w:rPr>
+            </w:pPr>
+            <w:r>
+              <w:rPr>
+                <w:rFonts w:ascii="Arial" w:hAnsi="Arial" w:cs="Arial"/>
+              </w:rPr>
+              <w:t>{{ m.description }}</w:t>
+            </w:r>
+          </w:p>
+          <w:p>
+            <w:pPr>
               <w:rPr>
                 <w:rFonts w:ascii="Arial" w:hAnsi="Arial" w:cs="Arial"/>
                 <w:b/>
                 <w:bCs/>
               </w:rPr>
-              <w:br/>
-            </w:r>
-          </w:p>
-          <w:p>
-            <w:pPr>
-              <w:rPr>
-                <w:rFonts w:ascii="Arial" w:hAnsi="Arial" w:cs="Arial"/>
-              </w:rPr>
-            </w:pPr>
-            <w:r>
-              <w:rPr>
-                <w:rFonts w:ascii="Arial" w:hAnsi="Arial" w:cs="Arial"/>
-              </w:rPr>
-              <w:t>{{ m.description }}</w:t>
-            </w:r>
-          </w:p>
-          <w:p>
-            <w:pPr>
-              <w:rPr>
-                <w:rFonts w:ascii="Arial" w:hAnsi="Arial" w:cs="Arial"/>
-                <w:b/>
-                <w:bCs/>
-              </w:rPr>
-            </w:pPr>
-          </w:p>
-        </w:tc>
-        <w:tc>
-          <w:tcPr>
-            <w:tcW w:w="1870" w:type="dxa"/>
+            </w:pPr>
+          </w:p>
+        </w:tc>
+        <w:tc>
+          <w:tcPr>
+            <w:tcW w:w="1865" w:type="dxa"/>
           </w:tcPr>
           <w:p>
             <w:pPr>
@@ -1105,7 +1234,7 @@
         </w:tc>
         <w:tc>
           <w:tcPr>
-            <w:tcW w:w="1870" w:type="dxa"/>
+            <w:tcW w:w="1853" w:type="dxa"/>
           </w:tcPr>
           <w:p>
             <w:pPr>
@@ -1123,32 +1252,97 @@
         </w:tc>
         <w:tc>
           <w:tcPr>
-            <w:tcW w:w="1870" w:type="dxa"/>
-          </w:tcPr>
-          <w:p>
-            <w:pPr>
-              <w:rPr>
-                <w:rFonts w:ascii="Arial" w:hAnsi="Arial" w:cs="Arial"/>
-              </w:rPr>
-            </w:pPr>
-            <w:r>
-              <w:rPr>
-                <w:rFonts w:ascii="Arial" w:hAnsi="Arial" w:cs="Arial"/>
-              </w:rPr>
-              <w:t>Status: {{ m.status }} {%</w:t>
-            </w:r>
-            <w:r>
-              <w:rPr>
-                <w:rFonts w:ascii="Arial" w:hAnsi="Arial" w:cs="Arial"/>
-              </w:rPr>
-              <w:t>tr</w:t>
-            </w:r>
-            <w:r>
-              <w:rPr>
-                <w:rFonts w:ascii="Arial" w:hAnsi="Arial" w:cs="Arial"/>
-              </w:rPr>
-              <w:t xml:space="preserve"> endfor %}{% tr %}</w:t>
-            </w:r>
+            <w:tcW w:w="1846" w:type="dxa"/>
+          </w:tcPr>
+          <w:p>
+            <w:pPr>
+              <w:rPr>
+                <w:rFonts w:ascii="Arial" w:hAnsi="Arial" w:cs="Arial"/>
+              </w:rPr>
+            </w:pPr>
+            <w:r>
+              <w:rPr>
+                <w:rFonts w:ascii="Arial" w:hAnsi="Arial" w:cs="Arial"/>
+              </w:rPr>
+              <w:t xml:space="preserve">Status: </w:t>
+            </w:r>
+            <w:r>
+              <w:rPr>
+                <w:rFonts w:ascii="Arial" w:hAnsi="Arial" w:cs="Arial"/>
+              </w:rPr>
+              <w:t xml:space="preserve">{{ m.status }} </w:t>
+            </w:r>
+          </w:p>
+        </w:tc>
+      </w:tr>
+      <w:tr>
+        <w:trPr>
+          <w:trHeight w:val="890"/>
+        </w:trPr>
+        <w:tc>
+          <w:tcPr>
+            <w:tcW w:w="1845" w:type="dxa"/>
+          </w:tcPr>
+          <w:p>
+            <w:pPr>
+              <w:rPr>
+                <w:rFonts w:ascii="Arial" w:hAnsi="Arial" w:cs="Arial"/>
+              </w:rPr>
+            </w:pPr>
+            <w:r>
+              <w:rPr>
+                <w:rFonts w:ascii="Arial" w:hAnsi="Arial" w:cs="Arial"/>
+              </w:rPr>
+              <w:t>{%tr endfor %}</w:t>
+            </w:r>
+          </w:p>
+        </w:tc>
+        <w:tc>
+          <w:tcPr>
+            <w:tcW w:w="1941" w:type="dxa"/>
+          </w:tcPr>
+          <w:p>
+            <w:pPr>
+              <w:rPr>
+                <w:rFonts w:ascii="Arial" w:hAnsi="Arial" w:cs="Arial"/>
+              </w:rPr>
+            </w:pPr>
+          </w:p>
+        </w:tc>
+        <w:tc>
+          <w:tcPr>
+            <w:tcW w:w="1865" w:type="dxa"/>
+          </w:tcPr>
+          <w:p>
+            <w:pPr>
+              <w:rPr>
+                <w:rFonts w:ascii="Arial" w:hAnsi="Arial" w:cs="Arial"/>
+              </w:rPr>
+            </w:pPr>
+          </w:p>
+        </w:tc>
+        <w:tc>
+          <w:tcPr>
+            <w:tcW w:w="1853" w:type="dxa"/>
+          </w:tcPr>
+          <w:p>
+            <w:pPr>
+              <w:rPr>
+                <w:rFonts w:ascii="Arial" w:hAnsi="Arial" w:cs="Arial"/>
+              </w:rPr>
+            </w:pPr>
+          </w:p>
+        </w:tc>
+        <w:tc>
+          <w:tcPr>
+            <w:tcW w:w="1846" w:type="dxa"/>
+          </w:tcPr>
+          <w:p>
+            <w:pPr>
+              <w:rPr>
+                <w:rFonts w:ascii="Arial" w:hAnsi="Arial" w:cs="Arial"/>
+              </w:rPr>
+            </w:pPr>
           </w:p>
         </w:tc>
       </w:tr>
@@ -1265,7 +1459,7 @@
               <w:rPr>
                 <w:rFonts w:ascii="Arial" w:hAnsi="Arial" w:cs="Arial"/>
               </w:rPr>
-              <w:t>{% tr %}{% for s in scorecards %} {{ loop.index }}</w:t>
+              <w:t>{%tr for s in scorecards %}</w:t>
             </w:r>
           </w:p>
         </w:tc>
@@ -1273,6 +1467,78 @@
           <w:tcPr>
             <w:tcW w:w="4515" w:type="dxa"/>
           </w:tcPr>
+          <w:p>
+            <w:pPr>
+              <w:rPr>
+                <w:rFonts w:ascii="Arial" w:hAnsi="Arial" w:cs="Arial"/>
+              </w:rPr>
+            </w:pPr>
+          </w:p>
+        </w:tc>
+        <w:tc>
+          <w:tcPr>
+            <w:tcW w:w="3110" w:type="dxa"/>
+          </w:tcPr>
+          <w:p>
+            <w:pPr>
+              <w:rPr>
+                <w:rFonts w:ascii="Arial" w:hAnsi="Arial" w:cs="Arial"/>
+              </w:rPr>
+            </w:pPr>
+          </w:p>
+        </w:tc>
+      </w:tr>
+      <w:tr>
+        <w:trPr>
+          <w:trHeight w:val="638"/>
+        </w:trPr>
+        <w:tc>
+          <w:tcPr>
+            <w:tcW w:w="1705" w:type="dxa"/>
+          </w:tcPr>
+          <w:p>
+            <w:pPr>
+              <w:rPr>
+                <w:rFonts w:ascii="Arial" w:hAnsi="Arial" w:cs="Arial"/>
+              </w:rPr>
+            </w:pPr>
+            <w:r>
+              <w:rPr>
+                <w:rFonts w:ascii="Arial" w:hAnsi="Arial" w:cs="Arial"/>
+              </w:rPr>
+              <w:t>{{ loop.index }}</w:t>
+            </w:r>
+          </w:p>
+        </w:tc>
+        <w:tc>
+          <w:tcPr>
+            <w:tcW w:w="4515" w:type="dxa"/>
+          </w:tcPr>
+          <w:p>
+            <w:pPr>
+              <w:rPr>
+                <w:rFonts w:ascii="Arial" w:hAnsi="Arial" w:cs="Arial"/>
+              </w:rPr>
+            </w:pPr>
+            <w:r>
+              <w:rPr>
+                <w:rFonts w:ascii="Arial" w:hAnsi="Arial" w:cs="Arial"/>
+              </w:rPr>
+              <w:t xml:space="preserve">{{ </w:t>
+            </w:r>
+            <w:r>
+              <w:rPr>
+                <w:rFonts w:ascii="Arial" w:hAnsi="Arial" w:cs="Arial"/>
+              </w:rPr>
+              <w:t>s</w:t>
+            </w:r>
+            <w:r>
+              <w:rPr>
+                <w:rFonts w:ascii="Arial" w:hAnsi="Arial" w:cs="Arial"/>
+              </w:rPr>
+              <w:t>.topic }}</w:t>
+            </w:r>
+          </w:p>
           <w:p>
             <w:pPr>
               <w:rPr>
@@ -1287,63 +1553,30 @@
                 <w:b/>
                 <w:bCs/>
               </w:rPr>
+              <w:br/>
+            </w:r>
+          </w:p>
+          <w:p>
+            <w:pPr>
+              <w:rPr>
+                <w:rFonts w:ascii="Arial" w:hAnsi="Arial" w:cs="Arial"/>
+              </w:rPr>
+            </w:pPr>
+            <w:r>
+              <w:rPr>
+                <w:rFonts w:ascii="Arial" w:hAnsi="Arial" w:cs="Arial"/>
+              </w:rPr>
               <w:t xml:space="preserve">{{ </w:t>
             </w:r>
             <w:r>
               <w:rPr>
                 <w:rFonts w:ascii="Arial" w:hAnsi="Arial" w:cs="Arial"/>
-                <w:b/>
-                <w:bCs/>
               </w:rPr>
               <w:t>s</w:t>
             </w:r>
             <w:r>
               <w:rPr>
                 <w:rFonts w:ascii="Arial" w:hAnsi="Arial" w:cs="Arial"/>
-                <w:b/>
-                <w:bCs/>
-              </w:rPr>
-              <w:t>.topic }}</w:t>
-            </w:r>
-          </w:p>
-          <w:p>
-            <w:pPr>
-              <w:rPr>
-                <w:rFonts w:ascii="Arial" w:hAnsi="Arial" w:cs="Arial"/>
-                <w:b/>
-                <w:bCs/>
-              </w:rPr>
-            </w:pPr>
-            <w:r>
-              <w:rPr>
-                <w:rFonts w:ascii="Arial" w:hAnsi="Arial" w:cs="Arial"/>
-                <w:b/>
-                <w:bCs/>
-              </w:rPr>
-              <w:br/>
-            </w:r>
-          </w:p>
-          <w:p>
-            <w:pPr>
-              <w:rPr>
-                <w:rFonts w:ascii="Arial" w:hAnsi="Arial" w:cs="Arial"/>
-              </w:rPr>
-            </w:pPr>
-            <w:r>
-              <w:rPr>
-                <w:rFonts w:ascii="Arial" w:hAnsi="Arial" w:cs="Arial"/>
-              </w:rPr>
-              <w:t xml:space="preserve">{{ </w:t>
-            </w:r>
-            <w:r>
-              <w:rPr>
-                <w:rFonts w:ascii="Arial" w:hAnsi="Arial" w:cs="Arial"/>
-              </w:rPr>
-              <w:t>s</w:t>
-            </w:r>
-            <w:r>
-              <w:rPr>
-                <w:rFonts w:ascii="Arial" w:hAnsi="Arial" w:cs="Arial"/>
               </w:rPr>
               <w:t>.description }}</w:t>
             </w:r>
@@ -1370,7 +1603,30 @@
               <w:rPr>
                 <w:rFonts w:ascii="Arial" w:hAnsi="Arial" w:cs="Arial"/>
               </w:rPr>
-              <w:t>Noted on Information {%</w:t>
+              <w:t xml:space="preserve">Noted on Information </w:t>
+            </w:r>
+          </w:p>
+        </w:tc>
+      </w:tr>
+      <w:tr>
+        <w:trPr>
+          <w:trHeight w:val="638"/>
+        </w:trPr>
+        <w:tc>
+          <w:tcPr>
+            <w:tcW w:w="1705" w:type="dxa"/>
+          </w:tcPr>
+          <w:p>
+            <w:pPr>
+              <w:rPr>
+                <w:rFonts w:ascii="Arial" w:hAnsi="Arial" w:cs="Arial"/>
+              </w:rPr>
+            </w:pPr>
+            <w:r>
+              <w:rPr>
+                <w:rFonts w:ascii="Arial" w:hAnsi="Arial" w:cs="Arial"/>
+              </w:rPr>
+              <w:t>{%</w:t>
             </w:r>
             <w:r>
               <w:rPr>
@@ -1382,8 +1638,32 @@
               <w:rPr>
                 <w:rFonts w:ascii="Arial" w:hAnsi="Arial" w:cs="Arial"/>
               </w:rPr>
-              <w:t xml:space="preserve"> endfor %}{% tr %}</w:t>
-            </w:r>
+              <w:t xml:space="preserve"> endfor %}</w:t>
+            </w:r>
+          </w:p>
+        </w:tc>
+        <w:tc>
+          <w:tcPr>
+            <w:tcW w:w="4515" w:type="dxa"/>
+          </w:tcPr>
+          <w:p>
+            <w:pPr>
+              <w:rPr>
+                <w:rFonts w:ascii="Arial" w:hAnsi="Arial" w:cs="Arial"/>
+              </w:rPr>
+            </w:pPr>
+          </w:p>
+        </w:tc>
+        <w:tc>
+          <w:tcPr>
+            <w:tcW w:w="3110" w:type="dxa"/>
+          </w:tcPr>
+          <w:p>
+            <w:pPr>
+              <w:rPr>
+                <w:rFonts w:ascii="Arial" w:hAnsi="Arial" w:cs="Arial"/>
+              </w:rPr>
+            </w:pPr>
           </w:p>
         </w:tc>
       </w:tr>
@@ -1468,7 +1748,19 @@
               <w:rPr>
                 <w:rFonts w:ascii="Arial" w:hAnsi="Arial" w:cs="Arial"/>
               </w:rPr>
-              <w:t>{% tr %}{% for e in endorsements %} {{ loop.index }}</w:t>
+              <w:t>{%tr for e in endorsements %}</w:t>
+            </w:r>
+            <w:r>
+              <w:rPr>
+                <w:rFonts w:ascii="Arial" w:hAnsi="Arial" w:cs="Arial"/>
+              </w:rPr>
+              <w:t xml:space="preserve"> </w:t>
+            </w:r>
+            <w:r>
+              <w:rPr>
+                <w:rFonts w:ascii="Arial" w:hAnsi="Arial" w:cs="Arial"/>
+              </w:rPr>
+              <w:t xml:space="preserve"> </w:t>
             </w:r>
           </w:p>
         </w:tc>
@@ -1482,11 +1774,69 @@
                 <w:rFonts w:ascii="Arial" w:hAnsi="Arial" w:cs="Arial"/>
               </w:rPr>
             </w:pPr>
-            <w:r>
-              <w:rPr>
-                <w:rFonts w:ascii="Arial" w:hAnsi="Arial" w:cs="Arial"/>
-              </w:rPr>
-              <w:t>{{ e.description }} {%</w:t>
+          </w:p>
+        </w:tc>
+      </w:tr>
+      <w:tr>
+        <w:trPr>
+          <w:trHeight w:val="521"/>
+        </w:trPr>
+        <w:tc>
+          <w:tcPr>
+            <w:tcW w:w="1705" w:type="dxa"/>
+          </w:tcPr>
+          <w:p>
+            <w:pPr>
+              <w:rPr>
+                <w:rFonts w:ascii="Arial" w:hAnsi="Arial" w:cs="Arial"/>
+              </w:rPr>
+            </w:pPr>
+            <w:r>
+              <w:rPr>
+                <w:rFonts w:ascii="Arial" w:hAnsi="Arial" w:cs="Arial"/>
+              </w:rPr>
+              <w:t>{{ loop.index }}</w:t>
+            </w:r>
+          </w:p>
+        </w:tc>
+        <w:tc>
+          <w:tcPr>
+            <w:tcW w:w="7609" w:type="dxa"/>
+          </w:tcPr>
+          <w:p>
+            <w:pPr>
+              <w:rPr>
+                <w:rFonts w:ascii="Arial" w:hAnsi="Arial" w:cs="Arial"/>
+              </w:rPr>
+            </w:pPr>
+            <w:r>
+              <w:rPr>
+                <w:rFonts w:ascii="Arial" w:hAnsi="Arial" w:cs="Arial"/>
+              </w:rPr>
+              <w:t xml:space="preserve">{{ e.description }} </w:t>
+            </w:r>
+          </w:p>
+        </w:tc>
+      </w:tr>
+      <w:tr>
+        <w:trPr>
+          <w:trHeight w:val="521"/>
+        </w:trPr>
+        <w:tc>
+          <w:tcPr>
+            <w:tcW w:w="1705" w:type="dxa"/>
+          </w:tcPr>
+          <w:p>
+            <w:pPr>
+              <w:rPr>
+                <w:rFonts w:ascii="Arial" w:hAnsi="Arial" w:cs="Arial"/>
+              </w:rPr>
+            </w:pPr>
+            <w:r>
+              <w:rPr>
+                <w:rFonts w:ascii="Arial" w:hAnsi="Arial" w:cs="Arial"/>
+              </w:rPr>
+              <w:t>{%</w:t>
             </w:r>
             <w:r>
               <w:rPr>
@@ -1498,8 +1848,20 @@
               <w:rPr>
                 <w:rFonts w:ascii="Arial" w:hAnsi="Arial" w:cs="Arial"/>
               </w:rPr>
-              <w:t xml:space="preserve"> endfor %}{% tr %}</w:t>
-            </w:r>
+              <w:t xml:space="preserve"> endfor %}</w:t>
+            </w:r>
+          </w:p>
+        </w:tc>
+        <w:tc>
+          <w:tcPr>
+            <w:tcW w:w="7609" w:type="dxa"/>
+          </w:tcPr>
+          <w:p>
+            <w:pPr>
+              <w:rPr>
+                <w:rFonts w:ascii="Arial" w:hAnsi="Arial" w:cs="Arial"/>
+              </w:rPr>
+            </w:pPr>
           </w:p>
         </w:tc>
       </w:tr>

</xml_diff>

<commit_message>
Fix small formatting in MoM_Template.docx
</commit_message>
<xml_diff>
--- a/MoM_Template.docx
+++ b/MoM_Template.docx
@@ -132,7 +132,13 @@
         <w:rPr>
           <w:rFonts w:ascii="Arial" w:hAnsi="Arial" w:cs="Arial"/>
         </w:rPr>
-        <w:t xml:space="preserve">Meeting </w:t>
+        <w:t>Meeting</w:t>
+      </w:r>
+      <w:r>
+        <w:rPr>
+          <w:rFonts w:ascii="Arial" w:hAnsi="Arial" w:cs="Arial"/>
+        </w:rPr>
+        <w:t xml:space="preserve"> #</w:t>
       </w:r>
       <w:r>
         <w:rPr>
@@ -461,7 +467,7 @@
         <w:rPr>
           <w:rFonts w:ascii="Arial" w:hAnsi="Arial" w:cs="Arial"/>
         </w:rPr>
-        <w:t>}} or MS Teams Meeting</w:t>
+        <w:t xml:space="preserve">}} </w:t>
       </w:r>
     </w:p>
     <w:p>
@@ -1892,22 +1898,31 @@
         <w:rPr>
           <w:rFonts w:ascii="Arial" w:hAnsi="Arial" w:cs="Arial"/>
         </w:rPr>
-        <w:t>{{ NAME_OF_MEETING }} {{ TYPE_OF_MEETING }} Meeting {{ MEETING_NUMBER }}</w:t>
-      </w:r>
-    </w:p>
-    <w:p>
-      <w:pPr>
-        <w:rPr>
-          <w:rFonts w:ascii="Arial" w:hAnsi="Arial" w:cs="Arial"/>
-          <w:b/>
-          <w:bCs/>
-        </w:rPr>
-      </w:pPr>
-      <w:r>
-        <w:rPr>
-          <w:rFonts w:ascii="Arial" w:hAnsi="Arial" w:cs="Arial"/>
-        </w:rPr>
-        <w:t xml:space="preserve"> adjourned at {{</w:t>
+        <w:t xml:space="preserve">{{ NAME_OF_MEETING }} {{ TYPE_OF_MEETING }} Meeting </w:t>
+      </w:r>
+      <w:r>
+        <w:rPr>
+          <w:rFonts w:ascii="Arial" w:hAnsi="Arial" w:cs="Arial"/>
+        </w:rPr>
+        <w:t>#</w:t>
+      </w:r>
+      <w:r>
+        <w:rPr>
+          <w:rFonts w:ascii="Arial" w:hAnsi="Arial" w:cs="Arial"/>
+        </w:rPr>
+        <w:t>{{ MEETING_NUMBER }}</w:t>
+      </w:r>
+      <w:r>
+        <w:rPr>
+          <w:rFonts w:ascii="Arial" w:hAnsi="Arial" w:cs="Arial"/>
+        </w:rPr>
+        <w:t xml:space="preserve"> </w:t>
+      </w:r>
+      <w:r>
+        <w:rPr>
+          <w:rFonts w:ascii="Arial" w:hAnsi="Arial" w:cs="Arial"/>
+        </w:rPr>
+        <w:t>adjourned at {{</w:t>
       </w:r>
       <w:r>
         <w:rPr>

</xml_diff>